<commit_message>
Prompt doc: add Task 9 — profile-likelihood WSSE contours (rigorous counterpart of Task 8)
Per-node re-optimization of the non-axis B(c) coefficients (nuisances) instead of pinning
them at the MLE: Phi_profile(psi) = min_lambda WSSE; supports likelihood-ratio confidence
regions (the Task-8 slice does not). Reuses _run_profile_contours method="profile"
(warm-start + per-node CPU cap + watchdog); Task 7's fixed S0/S shrink the nuisance set.

Co-Authored-By: Claude Opus 4.8 <noreply@anthropic.com>
</commit_message>
<xml_diff>
--- a/refactored_codes_v1/PROMPT_loader_timecorr_and_plots.docx
+++ b/refactored_codes_v1/PROMPT_loader_timecorr_and_plots.docx
@@ -2,7 +2,7 @@
 <file path=word/document.xml><?xml version="1.0" encoding="utf-8"?>
 <w:document xmlns:w="http://schemas.openxmlformats.org/wordprocessingml/2006/main" xmlns:m="http://schemas.openxmlformats.org/officeDocument/2006/math" xmlns:r="http://schemas.openxmlformats.org/officeDocument/2006/relationships" xmlns:o="urn:schemas-microsoft-com:office:office" xmlns:v="urn:schemas-microsoft-com:vml" xmlns:w10="urn:schemas-microsoft-com:office:word" xmlns:a="http://schemas.openxmlformats.org/drawingml/2006/main" xmlns:pic="http://schemas.openxmlformats.org/drawingml/2006/picture" xmlns:wp="http://schemas.openxmlformats.org/drawingml/2006/wordprocessingDrawing">
   <w:body>
-    <w:bookmarkStart w:id="21" w:name="Xba18ee4443b3365a6313bba308bae49ab6d4eed"/>
+    <w:bookmarkStart w:id="22" w:name="Xba18ee4443b3365a6313bba308bae49ab6d4eed"/>
     <w:p>
       <w:pPr>
         <w:pStyle w:val="Heading1"/>
@@ -4082,12 +4082,570 @@
       </w:r>
     </w:p>
     <w:bookmarkEnd w:id="18"/>
-    <w:bookmarkStart w:id="19" w:name="verification-checklist-run-at-the-end"/>
+    <w:bookmarkStart w:id="19" w:name="Xf05df7ebe48d1898c0ca1f7d3e780169c86564b"/>
     <w:p>
       <w:pPr>
         <w:pStyle w:val="Heading2"/>
       </w:pPr>
       <w:r>
+        <w:t xml:space="preserve">Task 9 — Profile-likelihood WSSE contour surfaces (rigorous counterpart of Task 8)</w:t>
+      </w:r>
+    </w:p>
+    <w:p>
+      <w:pPr>
+        <w:pStyle w:val="FirstParagraph"/>
+      </w:pPr>
+      <w:r>
+        <w:rPr>
+          <w:b/>
+          <w:bCs/>
+        </w:rPr>
+        <w:t xml:space="preserve">Objective.</w:t>
+      </w:r>
+      <w:r>
+        <w:t xml:space="preserve"> </w:t>
+      </w:r>
+      <w:r>
+        <w:t xml:space="preserve">Same scope as Task 8 — every DATA3 single-salt experiment × every B(c) form × the</w:t>
+      </w:r>
+      <w:r>
+        <w:t xml:space="preserve"> </w:t>
+      </w:r>
+      <w:r>
+        <w:t xml:space="preserve">Task-5 response channels — but compute the</w:t>
+      </w:r>
+      <w:r>
+        <w:t xml:space="preserve"> </w:t>
+      </w:r>
+      <w:r>
+        <w:rPr>
+          <w:b/>
+          <w:bCs/>
+        </w:rPr>
+        <w:t xml:space="preserve">profile-likelihood</w:t>
+      </w:r>
+      <w:r>
+        <w:t xml:space="preserve"> </w:t>
+      </w:r>
+      <w:r>
+        <w:t xml:space="preserve">surface: at each grid node,</w:t>
+      </w:r>
+      <w:r>
+        <w:t xml:space="preserve"> </w:t>
+      </w:r>
+      <w:r>
+        <w:rPr>
+          <w:b/>
+          <w:bCs/>
+        </w:rPr>
+        <w:t xml:space="preserve">do</w:t>
+      </w:r>
+      <w:r>
+        <w:rPr>
+          <w:b/>
+          <w:bCs/>
+        </w:rPr>
+        <w:t xml:space="preserve"> </w:t>
+      </w:r>
+      <w:r>
+        <w:rPr>
+          <w:b/>
+          <w:bCs/>
+        </w:rPr>
+        <w:t xml:space="preserve">NOT pre-fix the non-axis coefficients — re-optimize them.</w:t>
+      </w:r>
+    </w:p>
+    <w:p>
+      <w:pPr>
+        <w:pStyle w:val="BodyText"/>
+      </w:pPr>
+      <w:r>
+        <w:rPr>
+          <w:b/>
+          <w:bCs/>
+        </w:rPr>
+        <w:t xml:space="preserve">Method (per node).</w:t>
+      </w:r>
+      <w:r>
+        <w:t xml:space="preserve"> </w:t>
+      </w:r>
+      <w:r>
+        <w:t xml:space="preserve">Clamp the two axes (σ and the chosen B parameter), hold</w:t>
+      </w:r>
+      <w:r>
+        <w:t xml:space="preserve"> </w:t>
+      </w:r>
+      <w:r>
+        <w:rPr>
+          <w:rStyle w:val="VerbatimChar"/>
+        </w:rPr>
+        <w:t xml:space="preserve">Lp</w:t>
+      </w:r>
+      <w:r>
+        <w:t xml:space="preserve">,</w:t>
+      </w:r>
+      <w:r>
+        <w:t xml:space="preserve"> </w:t>
+      </w:r>
+      <w:r>
+        <w:rPr>
+          <w:rStyle w:val="VerbatimChar"/>
+        </w:rPr>
+        <w:t xml:space="preserve">S0</w:t>
+      </w:r>
+      <w:r>
+        <w:t xml:space="preserve">,</w:t>
+      </w:r>
+      <w:r>
+        <w:t xml:space="preserve"> </w:t>
+      </w:r>
+      <w:r>
+        <w:rPr>
+          <w:rStyle w:val="VerbatimChar"/>
+        </w:rPr>
+        <w:t xml:space="preserve">S</w:t>
+      </w:r>
+      <w:r>
+        <w:t xml:space="preserve"> </w:t>
+      </w:r>
+      <w:r>
+        <w:t xml:space="preserve">fixed (</w:t>
+      </w:r>
+      <w:r>
+        <w:rPr>
+          <w:rStyle w:val="VerbatimChar"/>
+        </w:rPr>
+        <w:t xml:space="preserve">Lp</w:t>
+      </w:r>
+      <w:r>
+        <w:t xml:space="preserve"> </w:t>
+      </w:r>
+      <w:r>
+        <w:t xml:space="preserve">optimum;</w:t>
+      </w:r>
+      <w:r>
+        <w:t xml:space="preserve"> </w:t>
+      </w:r>
+      <w:r>
+        <w:rPr>
+          <w:rStyle w:val="VerbatimChar"/>
+        </w:rPr>
+        <w:t xml:space="preserve">S0</w:t>
+      </w:r>
+      <w:r>
+        <w:t xml:space="preserve">/</w:t>
+      </w:r>
+      <w:r>
+        <w:rPr>
+          <w:rStyle w:val="VerbatimChar"/>
+        </w:rPr>
+        <w:t xml:space="preserve">S</w:t>
+      </w:r>
+      <w:r>
+        <w:t xml:space="preserve"> </w:t>
+      </w:r>
+      <w:r>
+        <w:t xml:space="preserve">recorded, per Task 7), then solve a sub-optimization over the</w:t>
+      </w:r>
+      <w:r>
+        <w:t xml:space="preserve"> </w:t>
+      </w:r>
+      <w:r>
+        <w:t xml:space="preserve">remaining free parameters λ (the non-axis B coefficients):</w:t>
+      </w:r>
+    </w:p>
+    <w:p>
+      <w:pPr>
+        <w:pStyle w:val="SourceCode"/>
+      </w:pPr>
+      <w:r>
+        <w:rPr>
+          <w:rStyle w:val="VerbatimChar"/>
+        </w:rPr>
+        <w:t xml:space="preserve">Phi_profile(psi)  =  min over lambda  of  WSSE(psi, lambda | Lp, S0, S fixed)</w:t>
+      </w:r>
+    </w:p>
+    <w:p>
+      <w:pPr>
+        <w:pStyle w:val="FirstParagraph"/>
+      </w:pPr>
+      <w:r>
+        <w:t xml:space="preserve">Record</w:t>
+      </w:r>
+      <w:r>
+        <w:t xml:space="preserve"> </w:t>
+      </w:r>
+      <w:r>
+        <w:rPr>
+          <w:rStyle w:val="VerbatimChar"/>
+        </w:rPr>
+        <w:t xml:space="preserve">Phi_profile</w:t>
+      </w:r>
+      <w:r>
+        <w:t xml:space="preserve"> </w:t>
+      </w:r>
+      <w:r>
+        <w:t xml:space="preserve">as the pixel value, AND store</w:t>
+      </w:r>
+      <w:r>
+        <w:t xml:space="preserve"> </w:t>
+      </w:r>
+      <w:r>
+        <w:rPr>
+          <w:rStyle w:val="VerbatimChar"/>
+        </w:rPr>
+        <w:t xml:space="preserve">lambda*(psi)</w:t>
+      </w:r>
+      <w:r>
+        <w:t xml:space="preserve"> </w:t>
+      </w:r>
+      <w:r>
+        <w:t xml:space="preserve">(the profiled nuisance values).</w:t>
+      </w:r>
+    </w:p>
+    <w:p>
+      <w:pPr>
+        <w:pStyle w:val="BodyText"/>
+      </w:pPr>
+      <w:r>
+        <w:rPr>
+          <w:b/>
+          <w:bCs/>
+        </w:rPr>
+        <w:t xml:space="preserve">Why (vs Task 8).</w:t>
+      </w:r>
+      <w:r>
+        <w:t xml:space="preserve"> </w:t>
+      </w:r>
+      <w:r>
+        <w:t xml:space="preserve">Task 8 pins λ at the MLE → a</w:t>
+      </w:r>
+      <w:r>
+        <w:t xml:space="preserve"> </w:t>
+      </w:r>
+      <w:r>
+        <w:rPr>
+          <w:i/>
+          <w:iCs/>
+        </w:rPr>
+        <w:t xml:space="preserve">conditional</w:t>
+      </w:r>
+      <w:r>
+        <w:t xml:space="preserve"> </w:t>
+      </w:r>
+      <w:r>
+        <w:t xml:space="preserve">(slice) surface, which is</w:t>
+      </w:r>
+      <w:r>
+        <w:t xml:space="preserve"> </w:t>
+      </w:r>
+      <w:r>
+        <w:rPr>
+          <w:b/>
+          <w:bCs/>
+        </w:rPr>
+        <w:t xml:space="preserve">not</w:t>
+      </w:r>
+      <w:r>
+        <w:t xml:space="preserve"> </w:t>
+      </w:r>
+      <w:r>
+        <w:t xml:space="preserve">a</w:t>
+      </w:r>
+      <w:r>
+        <w:t xml:space="preserve"> </w:t>
+      </w:r>
+      <w:r>
+        <w:t xml:space="preserve">valid confidence region. The profile re-optimizes λ → the surface supports</w:t>
+      </w:r>
+      <w:r>
+        <w:t xml:space="preserve"> </w:t>
+      </w:r>
+      <w:r>
+        <w:rPr>
+          <w:b/>
+          <w:bCs/>
+        </w:rPr>
+        <w:t xml:space="preserve">likelihood-ratio</w:t>
+      </w:r>
+      <w:r>
+        <w:rPr>
+          <w:b/>
+          <w:bCs/>
+        </w:rPr>
+        <w:t xml:space="preserve"> </w:t>
+      </w:r>
+      <w:r>
+        <w:rPr>
+          <w:b/>
+          <w:bCs/>
+        </w:rPr>
+        <w:t xml:space="preserve">confidence regions</w:t>
+      </w:r>
+      <w:r>
+        <w:t xml:space="preserve">:</w:t>
+      </w:r>
+    </w:p>
+    <w:p>
+      <w:pPr>
+        <w:pStyle w:val="SourceCode"/>
+      </w:pPr>
+      <w:r>
+        <w:rPr>
+          <w:rStyle w:val="VerbatimChar"/>
+        </w:rPr>
+        <w:t xml:space="preserve">CR  =  { psi :  Phi_profile(psi) - Phi_min  &lt;=  chi-square threshold }</w:t>
+      </w:r>
+    </w:p>
+    <w:p>
+      <w:pPr>
+        <w:pStyle w:val="FirstParagraph"/>
+      </w:pPr>
+      <w:r>
+        <w:t xml:space="preserve">Use it when the goal is honest identifiability / confidence intervals on σ and the B parameters.</w:t>
+      </w:r>
+    </w:p>
+    <w:p>
+      <w:pPr>
+        <w:pStyle w:val="BodyText"/>
+      </w:pPr>
+      <w:r>
+        <w:rPr>
+          <w:b/>
+          <w:bCs/>
+        </w:rPr>
+        <w:t xml:space="preserve">By-product to plot.</w:t>
+      </w:r>
+      <w:r>
+        <w:t xml:space="preserve"> </w:t>
+      </w:r>
+      <w:r>
+        <w:t xml:space="preserve">The profiled trajectories</w:t>
+      </w:r>
+      <w:r>
+        <w:t xml:space="preserve"> </w:t>
+      </w:r>
+      <w:r>
+        <w:rPr>
+          <w:rStyle w:val="VerbatimChar"/>
+        </w:rPr>
+        <w:t xml:space="preserve">lambda*(psi)</w:t>
+      </w:r>
+      <w:r>
+        <w:t xml:space="preserve"> </w:t>
+      </w:r>
+      <w:r>
+        <w:t xml:space="preserve">(e.g. β₀ as σ varies) directly</w:t>
+      </w:r>
+      <w:r>
+        <w:t xml:space="preserve"> </w:t>
+      </w:r>
+      <w:r>
+        <w:t xml:space="preserve">visualize the parameter correlations (the β₀–β₁ trade-off; whether β₁ tracks σ).</w:t>
+      </w:r>
+    </w:p>
+    <w:p>
+      <w:pPr>
+        <w:pStyle w:val="BodyText"/>
+      </w:pPr>
+      <w:r>
+        <w:rPr>
+          <w:b/>
+          <w:bCs/>
+        </w:rPr>
+        <w:t xml:space="preserve">Cost &amp; machinery (NOT square).</w:t>
+      </w:r>
+      <w:r>
+        <w:t xml:space="preserve"> </w:t>
+      </w:r>
+      <w:r>
+        <w:t xml:space="preserve">This is a nonlinear optimization at every node — you cannot keep</w:t>
+      </w:r>
+      <w:r>
+        <w:t xml:space="preserve"> </w:t>
+      </w:r>
+      <w:r>
+        <w:t xml:space="preserve">it a forward solve. Reuse the existing</w:t>
+      </w:r>
+      <w:r>
+        <w:t xml:space="preserve"> </w:t>
+      </w:r>
+      <w:r>
+        <w:rPr>
+          <w:rStyle w:val="VerbatimChar"/>
+        </w:rPr>
+        <w:t xml:space="preserve">_run_profile_contours.py</w:t>
+      </w:r>
+      <w:r>
+        <w:t xml:space="preserve"> </w:t>
+      </w:r>
+      <w:r>
+        <w:rPr>
+          <w:rStyle w:val="VerbatimChar"/>
+        </w:rPr>
+        <w:t xml:space="preserve">method="profile"</w:t>
+      </w:r>
+      <w:r>
+        <w:t xml:space="preserve"> </w:t>
+      </w:r>
+      <w:r>
+        <w:t xml:space="preserve">campaign:</w:t>
+      </w:r>
+    </w:p>
+    <w:p>
+      <w:pPr>
+        <w:pStyle w:val="Compact"/>
+        <w:numPr>
+          <w:ilvl w:val="0"/>
+          <w:numId w:val="1017"/>
+        </w:numPr>
+      </w:pPr>
+      <w:r>
+        <w:t xml:space="preserve">warm-start continuation (seed each node from a converged neighbour — a</w:t>
+      </w:r>
+      <w:r>
+        <w:t xml:space="preserve"> </w:t>
+      </w:r>
+      <w:r>
+        <w:rPr>
+          <w:i/>
+          <w:iCs/>
+        </w:rPr>
+        <w:t xml:space="preserve">guess</w:t>
+      </w:r>
+      <w:r>
+        <w:t xml:space="preserve">, not a fix),</w:t>
+      </w:r>
+    </w:p>
+    <w:p>
+      <w:pPr>
+        <w:pStyle w:val="Compact"/>
+        <w:numPr>
+          <w:ilvl w:val="0"/>
+          <w:numId w:val="1017"/>
+        </w:numPr>
+      </w:pPr>
+      <w:r>
+        <w:t xml:space="preserve">per-node IPOPT CPU cap + a bounded /</w:t>
+      </w:r>
+      <w:r>
+        <w:t xml:space="preserve"> </w:t>
+      </w:r>
+      <w:r>
+        <w:rPr>
+          <w:rStyle w:val="VerbatimChar"/>
+        </w:rPr>
+        <w:t xml:space="preserve">skip_sim_init</w:t>
+      </w:r>
+      <w:r>
+        <w:t xml:space="preserve"> </w:t>
+      </w:r>
+      <w:r>
+        <w:t xml:space="preserve">CasADi init,</w:t>
+      </w:r>
+    </w:p>
+    <w:p>
+      <w:pPr>
+        <w:pStyle w:val="Compact"/>
+        <w:numPr>
+          <w:ilvl w:val="0"/>
+          <w:numId w:val="1017"/>
+        </w:numPr>
+      </w:pPr>
+      <w:r>
+        <w:t xml:space="preserve">watchdog kill-restart + JSONL resume for stiff nodes (expect occasional holes).</w:t>
+      </w:r>
+      <w:r>
+        <w:t xml:space="preserve"> </w:t>
+      </w:r>
+      <w:r>
+        <w:t xml:space="preserve">Task 7 (fixed S0/S) shrinks λ, so each per-node solve is faster and more robust.</w:t>
+      </w:r>
+    </w:p>
+    <w:p>
+      <w:pPr>
+        <w:pStyle w:val="FirstParagraph"/>
+      </w:pPr>
+      <w:r>
+        <w:rPr>
+          <w:b/>
+          <w:bCs/>
+        </w:rPr>
+        <w:t xml:space="preserve">Deliverable.</w:t>
+      </w:r>
+      <w:r>
+        <w:t xml:space="preserve"> </w:t>
+      </w:r>
+      <w:r>
+        <w:t xml:space="preserve">One multi-panel profile contour per (experiment × B-form) — a panel per response</w:t>
+      </w:r>
+      <w:r>
+        <w:t xml:space="preserve"> </w:t>
+      </w:r>
+      <w:r>
+        <w:t xml:space="preserve">channel — with the LR confidence regions overlaid (optionally the profiled-λ trajectories); all</w:t>
+      </w:r>
+      <w:r>
+        <w:t xml:space="preserve"> </w:t>
+      </w:r>
+      <w:r>
+        <w:t xml:space="preserve">DATA3 single-salt sheets × all six forms.</w:t>
+      </w:r>
+    </w:p>
+    <w:p>
+      <w:pPr>
+        <w:pStyle w:val="BodyText"/>
+      </w:pPr>
+      <w:r>
+        <w:rPr>
+          <w:b/>
+          <w:bCs/>
+        </w:rPr>
+        <w:t xml:space="preserve">Acceptance.</w:t>
+      </w:r>
+      <w:r>
+        <w:t xml:space="preserve"> </w:t>
+      </w:r>
+      <w:r>
+        <w:t xml:space="preserve">Profile surfaces produced for every (experiment, B-form, channel); each minimum</w:t>
+      </w:r>
+      <w:r>
+        <w:t xml:space="preserve"> </w:t>
+      </w:r>
+      <w:r>
+        <w:t xml:space="preserve">coincides with the fit; LR confidence regions drawn; the flat-σ non-identifiability is confirmed</w:t>
+      </w:r>
+      <w:r>
+        <w:t xml:space="preserve"> </w:t>
+      </w:r>
+      <w:r>
+        <w:rPr>
+          <w:b/>
+          <w:bCs/>
+        </w:rPr>
+        <w:t xml:space="preserve">rigorously</w:t>
+      </w:r>
+      <w:r>
+        <w:t xml:space="preserve"> </w:t>
+      </w:r>
+      <w:r>
+        <w:t xml:space="preserve">(not just conditionally), and any difference from the Task-8 slice is noted.</w:t>
+      </w:r>
+    </w:p>
+    <w:p>
+      <w:r>
+        <w:pict>
+          <v:rect style="width:0;height:1.5pt" o:hralign="center" o:hrstd="t" o:hr="t"/>
+        </w:pict>
+      </w:r>
+    </w:p>
+    <w:bookmarkEnd w:id="19"/>
+    <w:bookmarkStart w:id="20" w:name="verification-checklist-run-at-the-end"/>
+    <w:p>
+      <w:pPr>
+        <w:pStyle w:val="Heading2"/>
+      </w:pPr>
+      <w:r>
         <w:t xml:space="preserve">Verification checklist (run at the end)</w:t>
       </w:r>
     </w:p>
@@ -4096,7 +4654,7 @@
         <w:pStyle w:val="Compact"/>
         <w:numPr>
           <w:ilvl w:val="0"/>
-          <w:numId w:val="1017"/>
+          <w:numId w:val="1018"/>
         </w:numPr>
       </w:pPr>
       <w:r>
@@ -4117,7 +4675,7 @@
         <w:pStyle w:val="Compact"/>
         <w:numPr>
           <w:ilvl w:val="0"/>
-          <w:numId w:val="1017"/>
+          <w:numId w:val="1018"/>
         </w:numPr>
       </w:pPr>
       <w:r>
@@ -4129,7 +4687,7 @@
         <w:pStyle w:val="Compact"/>
         <w:numPr>
           <w:ilvl w:val="0"/>
-          <w:numId w:val="1017"/>
+          <w:numId w:val="1018"/>
         </w:numPr>
       </w:pPr>
       <w:r>
@@ -4147,7 +4705,7 @@
         <w:pStyle w:val="Compact"/>
         <w:numPr>
           <w:ilvl w:val="0"/>
-          <w:numId w:val="1017"/>
+          <w:numId w:val="1018"/>
         </w:numPr>
       </w:pPr>
       <w:r>
@@ -4165,7 +4723,7 @@
         <w:pStyle w:val="Compact"/>
         <w:numPr>
           <w:ilvl w:val="0"/>
-          <w:numId w:val="1017"/>
+          <w:numId w:val="1018"/>
         </w:numPr>
       </w:pPr>
       <w:r>
@@ -4183,7 +4741,7 @@
         <w:pStyle w:val="Compact"/>
         <w:numPr>
           <w:ilvl w:val="0"/>
-          <w:numId w:val="1017"/>
+          <w:numId w:val="1018"/>
         </w:numPr>
       </w:pPr>
       <w:r>
@@ -4207,7 +4765,31 @@
         <w:pStyle w:val="Compact"/>
         <w:numPr>
           <w:ilvl w:val="0"/>
-          <w:numId w:val="1017"/>
+          <w:numId w:val="1018"/>
+        </w:numPr>
+      </w:pPr>
+      <w:r>
+        <w:t xml:space="preserve">Profile-likelihood WSSE contour surfaces (Task 9) generated per experiment × B-form × channel</w:t>
+      </w:r>
+      <w:r>
+        <w:t xml:space="preserve"> </w:t>
+      </w:r>
+      <w:r>
+        <w:t xml:space="preserve">with non-axis coefficients re-optimized per node; LR confidence regions drawn; flat-σ confirmed</w:t>
+      </w:r>
+      <w:r>
+        <w:t xml:space="preserve"> </w:t>
+      </w:r>
+      <w:r>
+        <w:t xml:space="preserve">rigorously vs the Task-8 slice.</w:t>
+      </w:r>
+    </w:p>
+    <w:p>
+      <w:pPr>
+        <w:pStyle w:val="Compact"/>
+        <w:numPr>
+          <w:ilvl w:val="0"/>
+          <w:numId w:val="1018"/>
         </w:numPr>
       </w:pPr>
       <w:r>
@@ -4219,7 +4801,7 @@
         <w:pStyle w:val="Compact"/>
         <w:numPr>
           <w:ilvl w:val="0"/>
-          <w:numId w:val="1017"/>
+          <w:numId w:val="1018"/>
         </w:numPr>
       </w:pPr>
       <w:r>
@@ -4237,7 +4819,7 @@
         <w:pStyle w:val="Compact"/>
         <w:numPr>
           <w:ilvl w:val="0"/>
-          <w:numId w:val="1017"/>
+          <w:numId w:val="1018"/>
         </w:numPr>
       </w:pPr>
       <w:r>
@@ -4253,8 +4835,8 @@
         <w:t xml:space="preserve">updated with the new time-correction config + plotting helpers.</w:t>
       </w:r>
     </w:p>
-    <w:bookmarkEnd w:id="19"/>
-    <w:bookmarkStart w:id="20" w:name="assumptions-baked-in-change-if-wrong"/>
+    <w:bookmarkEnd w:id="20"/>
+    <w:bookmarkStart w:id="21" w:name="assumptions-baked-in-change-if-wrong"/>
     <w:p>
       <w:pPr>
         <w:pStyle w:val="Heading2"/>
@@ -4268,7 +4850,7 @@
         <w:pStyle w:val="Compact"/>
         <w:numPr>
           <w:ilvl w:val="0"/>
-          <w:numId w:val="1018"/>
+          <w:numId w:val="1019"/>
         </w:numPr>
       </w:pPr>
       <w:r>
@@ -4296,7 +4878,7 @@
         <w:pStyle w:val="Compact"/>
         <w:numPr>
           <w:ilvl w:val="0"/>
-          <w:numId w:val="1018"/>
+          <w:numId w:val="1019"/>
         </w:numPr>
       </w:pPr>
       <w:r>
@@ -4333,7 +4915,7 @@
         <w:pStyle w:val="Compact"/>
         <w:numPr>
           <w:ilvl w:val="0"/>
-          <w:numId w:val="1018"/>
+          <w:numId w:val="1019"/>
         </w:numPr>
       </w:pPr>
       <w:r>
@@ -4346,8 +4928,8 @@
         <w:t xml:space="preserve">comparison; split if it gets crowded.</w:t>
       </w:r>
     </w:p>
-    <w:bookmarkEnd w:id="20"/>
     <w:bookmarkEnd w:id="21"/>
+    <w:bookmarkEnd w:id="22"/>
     <w:sectPr>
       <w:footnotePr>
         <w:numRestart w:val="eachSect"/>
@@ -4809,6 +5391,9 @@
     <w:abstractNumId w:val="991"/>
   </w:num>
   <w:num w:numId="1018">
+    <w:abstractNumId w:val="991"/>
+  </w:num>
+  <w:num w:numId="1019">
     <w:abstractNumId w:val="991"/>
   </w:num>
 </w:numbering>

</xml_diff>

<commit_message>
Prompt doc: add Task 10 — dimensional-consistency (units) audit + unit-change sensitivity test
Units table + term-by-term check of the model/analysis pipeline (Jw velocity vs LMH, the two
B conventions Js=B*dc vs Js=Jw*B*dc, dP vs dpi pressure, S0 g/s vs S g/hr, conductivity M/mM
& mS/uS), plus a sensitivity test: re-express inputs in different units with the matching
conversion and confirm fit + WSSE are invariant (catches hidden hard-coded unit assumptions).

Co-Authored-By: Claude Opus 4.8 <noreply@anthropic.com>
</commit_message>
<xml_diff>
--- a/refactored_codes_v1/PROMPT_loader_timecorr_and_plots.docx
+++ b/refactored_codes_v1/PROMPT_loader_timecorr_and_plots.docx
@@ -2,7 +2,7 @@
 <file path=word/document.xml><?xml version="1.0" encoding="utf-8"?>
 <w:document xmlns:w="http://schemas.openxmlformats.org/wordprocessingml/2006/main" xmlns:m="http://schemas.openxmlformats.org/officeDocument/2006/math" xmlns:r="http://schemas.openxmlformats.org/officeDocument/2006/relationships" xmlns:o="urn:schemas-microsoft-com:office:office" xmlns:v="urn:schemas-microsoft-com:vml" xmlns:w10="urn:schemas-microsoft-com:office:word" xmlns:a="http://schemas.openxmlformats.org/drawingml/2006/main" xmlns:pic="http://schemas.openxmlformats.org/drawingml/2006/picture" xmlns:wp="http://schemas.openxmlformats.org/drawingml/2006/wordprocessingDrawing">
   <w:body>
-    <w:bookmarkStart w:id="22" w:name="Xba18ee4443b3365a6313bba308bae49ab6d4eed"/>
+    <w:bookmarkStart w:id="23" w:name="Xba18ee4443b3365a6313bba308bae49ab6d4eed"/>
     <w:p>
       <w:pPr>
         <w:pStyle w:val="Heading1"/>
@@ -4640,13 +4640,87 @@
       </w:r>
     </w:p>
     <w:bookmarkEnd w:id="19"/>
-    <w:bookmarkStart w:id="20" w:name="verification-checklist-run-at-the-end"/>
+    <w:bookmarkStart w:id="20" w:name="Xc4aea188cb69381fa34db55a1a98f138a0e58df"/>
     <w:p>
       <w:pPr>
         <w:pStyle w:val="Heading2"/>
       </w:pPr>
       <w:r>
-        <w:t xml:space="preserve">Verification checklist (run at the end)</w:t>
+        <w:t xml:space="preserve">Task 10 — Dimensional-consistency (units) audit + unit-change sensitivity test</w:t>
+      </w:r>
+    </w:p>
+    <w:p>
+      <w:pPr>
+        <w:pStyle w:val="FirstParagraph"/>
+      </w:pPr>
+      <w:r>
+        <w:rPr>
+          <w:b/>
+          <w:bCs/>
+        </w:rPr>
+        <w:t xml:space="preserve">Objective.</w:t>
+      </w:r>
+      <w:r>
+        <w:t xml:space="preserve"> </w:t>
+      </w:r>
+      <w:r>
+        <w:t xml:space="preserve">Verify the whole DATA3 model + analysis pipeline is</w:t>
+      </w:r>
+      <w:r>
+        <w:t xml:space="preserve"> </w:t>
+      </w:r>
+      <w:r>
+        <w:rPr>
+          <w:b/>
+          <w:bCs/>
+        </w:rPr>
+        <w:t xml:space="preserve">dimensionally consistent</w:t>
+      </w:r>
+      <w:r>
+        <w:t xml:space="preserve"> </w:t>
+      </w:r>
+      <w:r>
+        <w:t xml:space="preserve">(no silent unit mismatches), document the unit of every variable/parameter/constant, and add a</w:t>
+      </w:r>
+      <w:r>
+        <w:t xml:space="preserve"> </w:t>
+      </w:r>
+      <w:r>
+        <w:t xml:space="preserve">small</w:t>
+      </w:r>
+      <w:r>
+        <w:t xml:space="preserve"> </w:t>
+      </w:r>
+      <w:r>
+        <w:rPr>
+          <w:b/>
+          <w:bCs/>
+        </w:rPr>
+        <w:t xml:space="preserve">sensitivity test</w:t>
+      </w:r>
+      <w:r>
+        <w:t xml:space="preserve"> </w:t>
+      </w:r>
+      <w:r>
+        <w:t xml:space="preserve">that re-expresses inputs in different units (with the matching</w:t>
+      </w:r>
+      <w:r>
+        <w:t xml:space="preserve"> </w:t>
+      </w:r>
+      <w:r>
+        <w:t xml:space="preserve">conversion) to confirm the physics is invariant.</w:t>
+      </w:r>
+    </w:p>
+    <w:p>
+      <w:pPr>
+        <w:pStyle w:val="BodyText"/>
+      </w:pPr>
+      <w:r>
+        <w:rPr>
+          <w:b/>
+          <w:bCs/>
+        </w:rPr>
+        <w:t xml:space="preserve">Part A — units audit.</w:t>
       </w:r>
     </w:p>
     <w:p>
@@ -4658,16 +4732,263 @@
         </w:numPr>
       </w:pPr>
       <w:r>
-        <w:rPr>
-          <w:rStyle w:val="VerbatimChar"/>
-        </w:rPr>
-        <w:t xml:space="preserve">pytest</w:t>
-      </w:r>
-      <w:r>
-        <w:t xml:space="preserve"> </w:t>
-      </w:r>
-      <w:r>
-        <w:t xml:space="preserve">DATA1 + DATA2 smoke/paper-comparison green (DATA1/DATA2 untouched).</w:t>
+        <w:t xml:space="preserve">Build a</w:t>
+      </w:r>
+      <w:r>
+        <w:t xml:space="preserve"> </w:t>
+      </w:r>
+      <w:r>
+        <w:rPr>
+          <w:b/>
+          <w:bCs/>
+        </w:rPr>
+        <w:t xml:space="preserve">units table</w:t>
+      </w:r>
+      <w:r>
+        <w:t xml:space="preserve"> </w:t>
+      </w:r>
+      <w:r>
+        <w:t xml:space="preserve">for every model quantity: mass (g),</w:t>
+      </w:r>
+      <w:r>
+        <w:t xml:space="preserve"> </w:t>
+      </w:r>
+      <w:r>
+        <w:rPr>
+          <w:rStyle w:val="VerbatimChar"/>
+        </w:rPr>
+        <w:t xml:space="preserve">S0</w:t>
+      </w:r>
+      <w:r>
+        <w:t xml:space="preserve"> </w:t>
+      </w:r>
+      <w:r>
+        <w:t xml:space="preserve">(g/s),</w:t>
+      </w:r>
+      <w:r>
+        <w:t xml:space="preserve"> </w:t>
+      </w:r>
+      <w:r>
+        <w:rPr>
+          <w:rStyle w:val="VerbatimChar"/>
+        </w:rPr>
+        <w:t xml:space="preserve">S</w:t>
+      </w:r>
+      <w:r>
+        <w:t xml:space="preserve"> </w:t>
+      </w:r>
+      <w:r>
+        <w:t xml:space="preserve">(g/hr),</w:t>
+      </w:r>
+      <w:r>
+        <w:t xml:space="preserve"> </w:t>
+      </w:r>
+      <w:r>
+        <w:t xml:space="preserve">concentrations</w:t>
+      </w:r>
+      <w:r>
+        <w:t xml:space="preserve"> </w:t>
+      </w:r>
+      <w:r>
+        <w:rPr>
+          <w:rStyle w:val="VerbatimChar"/>
+        </w:rPr>
+        <w:t xml:space="preserve">cF/cV/cD/cIn/cH</w:t>
+      </w:r>
+      <w:r>
+        <w:t xml:space="preserve"> </w:t>
+      </w:r>
+      <w:r>
+        <w:t xml:space="preserve">(mM),</w:t>
+      </w:r>
+      <w:r>
+        <w:t xml:space="preserve"> </w:t>
+      </w:r>
+      <w:r>
+        <w:rPr>
+          <w:rStyle w:val="VerbatimChar"/>
+        </w:rPr>
+        <w:t xml:space="preserve">Jw</w:t>
+      </w:r>
+      <w:r>
+        <w:t xml:space="preserve"> </w:t>
+      </w:r>
+      <w:r>
+        <w:t xml:space="preserve">(state which — LMH from</w:t>
+      </w:r>
+      <w:r>
+        <w:t xml:space="preserve"> </w:t>
+      </w:r>
+      <w:r>
+        <w:rPr>
+          <w:rStyle w:val="VerbatimChar"/>
+        </w:rPr>
+        <w:t xml:space="preserve">Lp·ΔP</w:t>
+      </w:r>
+      <w:r>
+        <w:t xml:space="preserve"> </w:t>
+      </w:r>
+      <w:r>
+        <w:t xml:space="preserve">vs velocity cm/s),</w:t>
+      </w:r>
+      <w:r>
+        <w:t xml:space="preserve"> </w:t>
+      </w:r>
+      <w:r>
+        <w:rPr>
+          <w:rStyle w:val="VerbatimChar"/>
+        </w:rPr>
+        <w:t xml:space="preserve">Lp</w:t>
+      </w:r>
+      <w:r>
+        <w:t xml:space="preserve"> </w:t>
+      </w:r>
+      <w:r>
+        <w:t xml:space="preserve">(L·m⁻²·h⁻¹·bar⁻¹),</w:t>
+      </w:r>
+      <w:r>
+        <w:t xml:space="preserve"> </w:t>
+      </w:r>
+      <w:r>
+        <w:rPr>
+          <w:rStyle w:val="VerbatimChar"/>
+        </w:rPr>
+        <w:t xml:space="preserve">ΔP</w:t>
+      </w:r>
+      <w:r>
+        <w:t xml:space="preserve"> </w:t>
+      </w:r>
+      <w:r>
+        <w:t xml:space="preserve">(bar),</w:t>
+      </w:r>
+      <w:r>
+        <w:t xml:space="preserve"> </w:t>
+      </w:r>
+      <w:r>
+        <w:rPr>
+          <w:rStyle w:val="VerbatimChar"/>
+        </w:rPr>
+        <w:t xml:space="preserve">Δπ</w:t>
+      </w:r>
+      <w:r>
+        <w:t xml:space="preserve"> </w:t>
+      </w:r>
+      <w:r>
+        <w:t xml:space="preserve">(bar, van 't Hoff</w:t>
+      </w:r>
+      <w:r>
+        <w:t xml:space="preserve"> </w:t>
+      </w:r>
+      <w:r>
+        <w:rPr>
+          <w:rStyle w:val="VerbatimChar"/>
+        </w:rPr>
+        <w:t xml:space="preserve">ni·R·T·Δc</w:t>
+      </w:r>
+      <w:r>
+        <w:t xml:space="preserve">),</w:t>
+      </w:r>
+      <w:r>
+        <w:t xml:space="preserve"> </w:t>
+      </w:r>
+      <w:r>
+        <w:rPr>
+          <w:rStyle w:val="VerbatimChar"/>
+        </w:rPr>
+        <w:t xml:space="preserve">B</w:t>
+      </w:r>
+      <w:r>
+        <w:t xml:space="preserve">,</w:t>
+      </w:r>
+      <w:r>
+        <w:t xml:space="preserve"> </w:t>
+      </w:r>
+      <w:r>
+        <w:rPr>
+          <w:rStyle w:val="VerbatimChar"/>
+        </w:rPr>
+        <w:t xml:space="preserve">σ</w:t>
+      </w:r>
+      <w:r>
+        <w:t xml:space="preserve"> </w:t>
+      </w:r>
+      <w:r>
+        <w:t xml:space="preserve">(–),</w:t>
+      </w:r>
+      <w:r>
+        <w:t xml:space="preserve"> </w:t>
+      </w:r>
+      <w:r>
+        <w:rPr>
+          <w:rStyle w:val="VerbatimChar"/>
+        </w:rPr>
+        <w:t xml:space="preserve">D</w:t>
+      </w:r>
+      <w:r>
+        <w:t xml:space="preserve"> </w:t>
+      </w:r>
+      <w:r>
+        <w:t xml:space="preserve">(cm²/s), the mass-transfer coeff</w:t>
+      </w:r>
+      <w:r>
+        <w:t xml:space="preserve"> </w:t>
+      </w:r>
+      <w:r>
+        <w:rPr>
+          <w:rStyle w:val="VerbatimChar"/>
+        </w:rPr>
+        <w:t xml:space="preserve">k</w:t>
+      </w:r>
+      <w:r>
+        <w:t xml:space="preserve"> </w:t>
+      </w:r>
+      <w:r>
+        <w:t xml:space="preserve">(cm/s),</w:t>
+      </w:r>
+      <w:r>
+        <w:t xml:space="preserve"> </w:t>
+      </w:r>
+      <w:r>
+        <w:rPr>
+          <w:rStyle w:val="VerbatimChar"/>
+        </w:rPr>
+        <w:t xml:space="preserve">Pe</w:t>
+      </w:r>
+      <w:r>
+        <w:t xml:space="preserve"> </w:t>
+      </w:r>
+      <w:r>
+        <w:t xml:space="preserve">(–), area</w:t>
+      </w:r>
+      <w:r>
+        <w:t xml:space="preserve"> </w:t>
+      </w:r>
+      <w:r>
+        <w:rPr>
+          <w:rStyle w:val="VerbatimChar"/>
+        </w:rPr>
+        <w:t xml:space="preserve">Am</w:t>
+      </w:r>
+      <w:r>
+        <w:t xml:space="preserve">, density</w:t>
+      </w:r>
+      <w:r>
+        <w:t xml:space="preserve"> </w:t>
+      </w:r>
+      <w:r>
+        <w:rPr>
+          <w:rStyle w:val="VerbatimChar"/>
+        </w:rPr>
+        <w:t xml:space="preserve">rho</w:t>
+      </w:r>
+      <w:r>
+        <w:t xml:space="preserve">, time</w:t>
+      </w:r>
+      <w:r>
+        <w:t xml:space="preserve"> </w:t>
+      </w:r>
+      <w:r>
+        <w:t xml:space="preserve">(min vs s), and the conductivity domain (mS/cm, µS/cm; M vs mM in Shedlovsky/MSA).</w:t>
       </w:r>
     </w:p>
     <w:p>
@@ -4679,7 +5000,458 @@
         </w:numPr>
       </w:pPr>
       <w:r>
-        <w:t xml:space="preserve">Per-sheet concentration-range table (Task 4) emitted as CSV + markdown for each DATA3 sheet.</w:t>
+        <w:t xml:space="preserve">Check each equation</w:t>
+      </w:r>
+      <w:r>
+        <w:t xml:space="preserve"> </w:t>
+      </w:r>
+      <w:r>
+        <w:rPr>
+          <w:b/>
+          <w:bCs/>
+        </w:rPr>
+        <w:t xml:space="preserve">term-by-term</w:t>
+      </w:r>
+      <w:r>
+        <w:t xml:space="preserve">, paying special attention to the cross-unit interfaces</w:t>
+      </w:r>
+      <w:r>
+        <w:t xml:space="preserve"> </w:t>
+      </w:r>
+      <w:r>
+        <w:t xml:space="preserve">that are easy to get wrong:</w:t>
+      </w:r>
+    </w:p>
+    <w:p>
+      <w:pPr>
+        <w:pStyle w:val="Compact"/>
+        <w:numPr>
+          <w:ilvl w:val="1"/>
+          <w:numId w:val="1019"/>
+        </w:numPr>
+      </w:pPr>
+      <w:r>
+        <w:rPr>
+          <w:rStyle w:val="VerbatimChar"/>
+          <w:b/>
+          <w:bCs/>
+        </w:rPr>
+        <w:t xml:space="preserve">Jw</w:t>
+      </w:r>
+      <w:r>
+        <w:rPr>
+          <w:b/>
+          <w:bCs/>
+        </w:rPr>
+        <w:t xml:space="preserve"> </w:t>
+      </w:r>
+      <w:r>
+        <w:rPr>
+          <w:b/>
+          <w:bCs/>
+        </w:rPr>
+        <w:t xml:space="preserve">consistency:</w:t>
+      </w:r>
+      <w:r>
+        <w:t xml:space="preserve"> </w:t>
+      </w:r>
+      <w:r>
+        <w:t xml:space="preserve">it appears as a velocity in</w:t>
+      </w:r>
+      <w:r>
+        <w:t xml:space="preserve"> </w:t>
+      </w:r>
+      <w:r>
+        <w:rPr>
+          <w:rStyle w:val="VerbatimChar"/>
+        </w:rPr>
+        <w:t xml:space="preserve">exp(Jw/k)</w:t>
+      </w:r>
+      <w:r>
+        <w:t xml:space="preserve">, in</w:t>
+      </w:r>
+      <w:r>
+        <w:t xml:space="preserve"> </w:t>
+      </w:r>
+      <w:r>
+        <w:rPr>
+          <w:rStyle w:val="VerbatimChar"/>
+        </w:rPr>
+        <w:t xml:space="preserve">Am·rho·Jw</w:t>
+      </w:r>
+      <w:r>
+        <w:t xml:space="preserve"> </w:t>
+      </w:r>
+      <w:r>
+        <w:t xml:space="preserve">(a mass rate),</w:t>
+      </w:r>
+      <w:r>
+        <w:t xml:space="preserve"> </w:t>
+      </w:r>
+      <w:r>
+        <w:t xml:space="preserve">and in</w:t>
+      </w:r>
+      <w:r>
+        <w:t xml:space="preserve"> </w:t>
+      </w:r>
+      <w:r>
+        <w:rPr>
+          <w:rStyle w:val="VerbatimChar"/>
+        </w:rPr>
+        <w:t xml:space="preserve">Pe = Jw·L/Dm</w:t>
+      </w:r>
+      <w:r>
+        <w:t xml:space="preserve">. Confirm</w:t>
+      </w:r>
+      <w:r>
+        <w:t xml:space="preserve"> </w:t>
+      </w:r>
+      <w:r>
+        <w:rPr>
+          <w:rStyle w:val="VerbatimChar"/>
+        </w:rPr>
+        <w:t xml:space="preserve">Jw</w:t>
+      </w:r>
+      <w:r>
+        <w:t xml:space="preserve"> </w:t>
+      </w:r>
+      <w:r>
+        <w:t xml:space="preserve">is converted to the</w:t>
+      </w:r>
+      <w:r>
+        <w:t xml:space="preserve"> </w:t>
+      </w:r>
+      <w:r>
+        <w:rPr>
+          <w:i/>
+          <w:iCs/>
+        </w:rPr>
+        <w:t xml:space="preserve">same</w:t>
+      </w:r>
+      <w:r>
+        <w:t xml:space="preserve"> </w:t>
+      </w:r>
+      <w:r>
+        <w:t xml:space="preserve">velocity units everywhere</w:t>
+      </w:r>
+      <w:r>
+        <w:t xml:space="preserve"> </w:t>
+      </w:r>
+      <w:r>
+        <w:t xml:space="preserve">(</w:t>
+      </w:r>
+      <w:r>
+        <w:rPr>
+          <w:rStyle w:val="VerbatimChar"/>
+        </w:rPr>
+        <w:t xml:space="preserve">Lp·ΔP</w:t>
+      </w:r>
+      <w:r>
+        <w:t xml:space="preserve"> </w:t>
+      </w:r>
+      <w:r>
+        <w:t xml:space="preserve">yields LMH — flag any spot that uses LMH where cm/s is required).</w:t>
+      </w:r>
+    </w:p>
+    <w:p>
+      <w:pPr>
+        <w:pStyle w:val="Compact"/>
+        <w:numPr>
+          <w:ilvl w:val="1"/>
+          <w:numId w:val="1019"/>
+        </w:numPr>
+      </w:pPr>
+      <w:r>
+        <w:rPr>
+          <w:rStyle w:val="VerbatimChar"/>
+          <w:b/>
+          <w:bCs/>
+        </w:rPr>
+        <w:t xml:space="preserve">B</w:t>
+      </w:r>
+      <w:r>
+        <w:rPr>
+          <w:b/>
+          <w:bCs/>
+        </w:rPr>
+        <w:t xml:space="preserve"> </w:t>
+      </w:r>
+      <w:r>
+        <w:rPr>
+          <w:b/>
+          <w:bCs/>
+        </w:rPr>
+        <w:t xml:space="preserve">has two conventions:</w:t>
+      </w:r>
+      <w:r>
+        <w:t xml:space="preserve"> </w:t>
+      </w:r>
+      <w:r>
+        <w:t xml:space="preserve">single uses</w:t>
+      </w:r>
+      <w:r>
+        <w:t xml:space="preserve"> </w:t>
+      </w:r>
+      <w:r>
+        <w:rPr>
+          <w:rStyle w:val="VerbatimChar"/>
+        </w:rPr>
+        <w:t xml:space="preserve">Js = B·(cIn−cH)</w:t>
+      </w:r>
+      <w:r>
+        <w:t xml:space="preserve">; the B(c) forms use</w:t>
+      </w:r>
+      <w:r>
+        <w:t xml:space="preserve"> </w:t>
+      </w:r>
+      <w:r>
+        <w:rPr>
+          <w:rStyle w:val="VerbatimChar"/>
+        </w:rPr>
+        <w:t xml:space="preserve">Js = Jw·B·(cIn−cH)</w:t>
+      </w:r>
+      <w:r>
+        <w:t xml:space="preserve"> </w:t>
+      </w:r>
+      <w:r>
+        <w:t xml:space="preserve">→</w:t>
+      </w:r>
+      <w:r>
+        <w:t xml:space="preserve"> </w:t>
+      </w:r>
+      <w:r>
+        <w:rPr>
+          <w:b/>
+          <w:bCs/>
+        </w:rPr>
+        <w:t xml:space="preserve">different units for</w:t>
+      </w:r>
+      <w:r>
+        <w:rPr>
+          <w:b/>
+          <w:bCs/>
+        </w:rPr>
+        <w:t xml:space="preserve"> </w:t>
+      </w:r>
+      <w:r>
+        <w:rPr>
+          <w:rStyle w:val="VerbatimChar"/>
+          <w:b/>
+          <w:bCs/>
+        </w:rPr>
+        <w:t xml:space="preserve">B</w:t>
+      </w:r>
+      <w:r>
+        <w:t xml:space="preserve">. Confirm the apparent-µm/s conversion</w:t>
+      </w:r>
+      <w:r>
+        <w:t xml:space="preserve"> </w:t>
+      </w:r>
+      <w:r>
+        <w:t xml:space="preserve">(</w:t>
+      </w:r>
+      <w:r>
+        <w:rPr>
+          <w:rStyle w:val="VerbatimChar"/>
+        </w:rPr>
+        <w:t xml:space="preserve">×Jw·1e4</w:t>
+      </w:r>
+      <w:r>
+        <w:t xml:space="preserve">) is applied consistently and the contour/overlay axes use one convention.</w:t>
+      </w:r>
+    </w:p>
+    <w:p>
+      <w:pPr>
+        <w:pStyle w:val="Compact"/>
+        <w:numPr>
+          <w:ilvl w:val="1"/>
+          <w:numId w:val="1019"/>
+        </w:numPr>
+      </w:pPr>
+      <w:r>
+        <w:rPr>
+          <w:rStyle w:val="VerbatimChar"/>
+          <w:b/>
+          <w:bCs/>
+        </w:rPr>
+        <w:t xml:space="preserve">ΔP</w:t>
+      </w:r>
+      <w:r>
+        <w:rPr>
+          <w:b/>
+          <w:bCs/>
+        </w:rPr>
+        <w:t xml:space="preserve"> </w:t>
+      </w:r>
+      <w:r>
+        <w:rPr>
+          <w:b/>
+          <w:bCs/>
+        </w:rPr>
+        <w:t xml:space="preserve">vs</w:t>
+      </w:r>
+      <w:r>
+        <w:rPr>
+          <w:b/>
+          <w:bCs/>
+        </w:rPr>
+        <w:t xml:space="preserve"> </w:t>
+      </w:r>
+      <w:r>
+        <w:rPr>
+          <w:rStyle w:val="VerbatimChar"/>
+          <w:b/>
+          <w:bCs/>
+        </w:rPr>
+        <w:t xml:space="preserve">Δπ</w:t>
+      </w:r>
+      <w:r>
+        <w:t xml:space="preserve"> </w:t>
+      </w:r>
+      <w:r>
+        <w:t xml:space="preserve">pressure units in</w:t>
+      </w:r>
+      <w:r>
+        <w:t xml:space="preserve"> </w:t>
+      </w:r>
+      <w:r>
+        <w:rPr>
+          <w:rStyle w:val="VerbatimChar"/>
+        </w:rPr>
+        <w:t xml:space="preserve">Jw = Lp(ΔP − σ·Δπ)</w:t>
+      </w:r>
+      <w:r>
+        <w:t xml:space="preserve"> </w:t>
+      </w:r>
+      <w:r>
+        <w:t xml:space="preserve">(van 't Hoff mM→pressure; bar vs Pa).</w:t>
+      </w:r>
+    </w:p>
+    <w:p>
+      <w:pPr>
+        <w:pStyle w:val="Compact"/>
+        <w:numPr>
+          <w:ilvl w:val="1"/>
+          <w:numId w:val="1019"/>
+        </w:numPr>
+      </w:pPr>
+      <w:r>
+        <w:rPr>
+          <w:rStyle w:val="VerbatimChar"/>
+          <w:b/>
+          <w:bCs/>
+        </w:rPr>
+        <w:t xml:space="preserve">S0</w:t>
+      </w:r>
+      <w:r>
+        <w:rPr>
+          <w:b/>
+          <w:bCs/>
+        </w:rPr>
+        <w:t xml:space="preserve"> </w:t>
+      </w:r>
+      <w:r>
+        <w:rPr>
+          <w:b/>
+          <w:bCs/>
+        </w:rPr>
+        <w:t xml:space="preserve">(g/s) vs</w:t>
+      </w:r>
+      <w:r>
+        <w:rPr>
+          <w:b/>
+          <w:bCs/>
+        </w:rPr>
+        <w:t xml:space="preserve"> </w:t>
+      </w:r>
+      <w:r>
+        <w:rPr>
+          <w:rStyle w:val="VerbatimChar"/>
+          <w:b/>
+          <w:bCs/>
+        </w:rPr>
+        <w:t xml:space="preserve">S</w:t>
+      </w:r>
+      <w:r>
+        <w:rPr>
+          <w:b/>
+          <w:bCs/>
+        </w:rPr>
+        <w:t xml:space="preserve"> </w:t>
+      </w:r>
+      <w:r>
+        <w:rPr>
+          <w:b/>
+          <w:bCs/>
+        </w:rPr>
+        <w:t xml:space="preserve">(g/hr)</w:t>
+      </w:r>
+      <w:r>
+        <w:t xml:space="preserve"> </w:t>
+      </w:r>
+      <w:r>
+        <w:t xml:space="preserve">— the</w:t>
+      </w:r>
+      <w:r>
+        <w:t xml:space="preserve"> </w:t>
+      </w:r>
+      <w:r>
+        <w:rPr>
+          <w:rStyle w:val="VerbatimChar"/>
+        </w:rPr>
+        <w:t xml:space="preserve">/3600</w:t>
+      </w:r>
+      <w:r>
+        <w:t xml:space="preserve">; confirm the time-scaling</w:t>
+      </w:r>
+      <w:r>
+        <w:t xml:space="preserve"> </w:t>
+      </w:r>
+      <w:r>
+        <w:rPr>
+          <w:rStyle w:val="VerbatimChar"/>
+        </w:rPr>
+        <w:t xml:space="preserve">(TF−TI)/Tauf</w:t>
+      </w:r>
+      <w:r>
+        <w:t xml:space="preserve"> </w:t>
+      </w:r>
+      <w:r>
+        <w:t xml:space="preserve">is</w:t>
+      </w:r>
+      <w:r>
+        <w:t xml:space="preserve"> </w:t>
+      </w:r>
+      <w:r>
+        <w:t xml:space="preserve">dimensionless and the time axis (min vs s) is consistent.</w:t>
+      </w:r>
+    </w:p>
+    <w:p>
+      <w:pPr>
+        <w:pStyle w:val="Compact"/>
+        <w:numPr>
+          <w:ilvl w:val="1"/>
+          <w:numId w:val="1019"/>
+        </w:numPr>
+      </w:pPr>
+      <w:r>
+        <w:rPr>
+          <w:b/>
+          <w:bCs/>
+        </w:rPr>
+        <w:t xml:space="preserve">Conductivity:</w:t>
+      </w:r>
+      <w:r>
+        <w:t xml:space="preserve"> </w:t>
+      </w:r>
+      <w:r>
+        <w:t xml:space="preserve">Shedlovsky/MSA input concentration units (M vs mM), outputs (mS/cm vs</w:t>
+      </w:r>
+      <w:r>
+        <w:t xml:space="preserve"> </w:t>
+      </w:r>
+      <w:r>
+        <w:t xml:space="preserve">µS/cm), and the EC25 temperature compensation.</w:t>
       </w:r>
     </w:p>
     <w:p>
@@ -4691,6 +5463,343 @@
         </w:numPr>
       </w:pPr>
       <w:r>
+        <w:t xml:space="preserve">Document findings; fix any genuine mismatch (guard DATA3-only if it touches the shared model;</w:t>
+      </w:r>
+      <w:r>
+        <w:t xml:space="preserve"> </w:t>
+      </w:r>
+      <w:r>
+        <w:t xml:space="preserve">never silently change DATA1/DATA2 numerics — flag those).</w:t>
+      </w:r>
+    </w:p>
+    <w:p>
+      <w:pPr>
+        <w:pStyle w:val="FirstParagraph"/>
+      </w:pPr>
+      <w:r>
+        <w:rPr>
+          <w:b/>
+          <w:bCs/>
+        </w:rPr>
+        <w:t xml:space="preserve">Part B — unit-change sensitivity test.</w:t>
+      </w:r>
+    </w:p>
+    <w:p>
+      <w:pPr>
+        <w:pStyle w:val="Compact"/>
+        <w:numPr>
+          <w:ilvl w:val="0"/>
+          <w:numId w:val="1020"/>
+        </w:numPr>
+      </w:pPr>
+      <w:r>
+        <w:t xml:space="preserve">For a representative DATA3 sheet: run the fit, then</w:t>
+      </w:r>
+      <w:r>
+        <w:t xml:space="preserve"> </w:t>
+      </w:r>
+      <w:r>
+        <w:rPr>
+          <w:b/>
+          <w:bCs/>
+        </w:rPr>
+        <w:t xml:space="preserve">re-run with one input in different units +</w:t>
+      </w:r>
+      <w:r>
+        <w:rPr>
+          <w:b/>
+          <w:bCs/>
+        </w:rPr>
+        <w:t xml:space="preserve"> </w:t>
+      </w:r>
+      <w:r>
+        <w:rPr>
+          <w:b/>
+          <w:bCs/>
+        </w:rPr>
+        <w:t xml:space="preserve">the correct conversion</w:t>
+      </w:r>
+      <w:r>
+        <w:t xml:space="preserve"> </w:t>
+      </w:r>
+      <w:r>
+        <w:t xml:space="preserve">(e.g.</w:t>
+      </w:r>
+      <w:r>
+        <w:t xml:space="preserve"> </w:t>
+      </w:r>
+      <w:r>
+        <w:rPr>
+          <w:rStyle w:val="VerbatimChar"/>
+        </w:rPr>
+        <w:t xml:space="preserve">ΔP</w:t>
+      </w:r>
+      <w:r>
+        <w:t xml:space="preserve"> </w:t>
+      </w:r>
+      <w:r>
+        <w:t xml:space="preserve">in Pa with</w:t>
+      </w:r>
+      <w:r>
+        <w:t xml:space="preserve"> </w:t>
+      </w:r>
+      <w:r>
+        <w:rPr>
+          <w:rStyle w:val="VerbatimChar"/>
+        </w:rPr>
+        <w:t xml:space="preserve">Lp</w:t>
+      </w:r>
+      <w:r>
+        <w:t xml:space="preserve"> </w:t>
+      </w:r>
+      <w:r>
+        <w:t xml:space="preserve">converted; or concentrations in M not mM;</w:t>
+      </w:r>
+      <w:r>
+        <w:t xml:space="preserve"> </w:t>
+      </w:r>
+      <w:r>
+        <w:t xml:space="preserve">or</w:t>
+      </w:r>
+      <w:r>
+        <w:t xml:space="preserve"> </w:t>
+      </w:r>
+      <w:r>
+        <w:rPr>
+          <w:rStyle w:val="VerbatimChar"/>
+        </w:rPr>
+        <w:t xml:space="preserve">Jw</w:t>
+      </w:r>
+      <w:r>
+        <w:t xml:space="preserve">/area in SI). The fitted</w:t>
+      </w:r>
+      <w:r>
+        <w:t xml:space="preserve"> </w:t>
+      </w:r>
+      <w:r>
+        <w:rPr>
+          <w:rStyle w:val="VerbatimChar"/>
+        </w:rPr>
+        <w:t xml:space="preserve">Lp/B/σ</w:t>
+      </w:r>
+      <w:r>
+        <w:t xml:space="preserve"> </w:t>
+      </w:r>
+      <w:r>
+        <w:t xml:space="preserve">(back in consistent units) and the WSSE</w:t>
+      </w:r>
+      <w:r>
+        <w:t xml:space="preserve"> </w:t>
+      </w:r>
+      <w:r>
+        <w:rPr>
+          <w:b/>
+          <w:bCs/>
+        </w:rPr>
+        <w:t xml:space="preserve">must be</w:t>
+      </w:r>
+      <w:r>
+        <w:rPr>
+          <w:b/>
+          <w:bCs/>
+        </w:rPr>
+        <w:t xml:space="preserve"> </w:t>
+      </w:r>
+      <w:r>
+        <w:rPr>
+          <w:b/>
+          <w:bCs/>
+        </w:rPr>
+        <w:t xml:space="preserve">invariant.</w:t>
+      </w:r>
+      <w:r>
+        <w:t xml:space="preserve"> </w:t>
+      </w:r>
+      <w:r>
+        <w:t xml:space="preserve">Any change exposes a hidden hard-coded unit assumption (a bug).</w:t>
+      </w:r>
+    </w:p>
+    <w:p>
+      <w:pPr>
+        <w:pStyle w:val="Compact"/>
+        <w:numPr>
+          <w:ilvl w:val="0"/>
+          <w:numId w:val="1020"/>
+        </w:numPr>
+      </w:pPr>
+      <w:r>
+        <w:t xml:space="preserve">Add a</w:t>
+      </w:r>
+      <w:r>
+        <w:t xml:space="preserve"> </w:t>
+      </w:r>
+      <w:r>
+        <w:rPr>
+          <w:b/>
+          <w:bCs/>
+        </w:rPr>
+        <w:t xml:space="preserve">dimensional scaling check</w:t>
+      </w:r>
+      <w:r>
+        <w:t xml:space="preserve">: multiply an input by a known factor and confirm the outputs</w:t>
+      </w:r>
+      <w:r>
+        <w:t xml:space="preserve"> </w:t>
+      </w:r>
+      <w:r>
+        <w:t xml:space="preserve">scale exactly as dimensional analysis predicts.</w:t>
+      </w:r>
+    </w:p>
+    <w:p>
+      <w:pPr>
+        <w:pStyle w:val="Compact"/>
+        <w:numPr>
+          <w:ilvl w:val="0"/>
+          <w:numId w:val="1020"/>
+        </w:numPr>
+      </w:pPr>
+      <w:r>
+        <w:t xml:space="preserve">Optionally wire 1–2 of these as</w:t>
+      </w:r>
+      <w:r>
+        <w:t xml:space="preserve"> </w:t>
+      </w:r>
+      <w:r>
+        <w:rPr>
+          <w:b/>
+          <w:bCs/>
+        </w:rPr>
+        <w:t xml:space="preserve">pytest invariants</w:t>
+      </w:r>
+      <w:r>
+        <w:t xml:space="preserve"> </w:t>
+      </w:r>
+      <w:r>
+        <w:t xml:space="preserve">(DATA3-guarded) so unit regressions are</w:t>
+      </w:r>
+      <w:r>
+        <w:t xml:space="preserve"> </w:t>
+      </w:r>
+      <w:r>
+        <w:t xml:space="preserve">caught automatically.</w:t>
+      </w:r>
+    </w:p>
+    <w:p>
+      <w:pPr>
+        <w:pStyle w:val="FirstParagraph"/>
+      </w:pPr>
+      <w:r>
+        <w:rPr>
+          <w:b/>
+          <w:bCs/>
+        </w:rPr>
+        <w:t xml:space="preserve">Acceptance.</w:t>
+      </w:r>
+      <w:r>
+        <w:t xml:space="preserve"> </w:t>
+      </w:r>
+      <w:r>
+        <w:t xml:space="preserve">A units table + term-by-term consistency report committed (e.g. a</w:t>
+      </w:r>
+      <w:r>
+        <w:t xml:space="preserve"> </w:t>
+      </w:r>
+      <w:r>
+        <w:rPr>
+          <w:rStyle w:val="VerbatimChar"/>
+        </w:rPr>
+        <w:t xml:space="preserve">UNITS.md</w:t>
+      </w:r>
+      <w:r>
+        <w:t xml:space="preserve"> </w:t>
+      </w:r>
+      <w:r>
+        <w:t xml:space="preserve">or a</w:t>
+      </w:r>
+      <w:r>
+        <w:t xml:space="preserve"> </w:t>
+      </w:r>
+      <w:r>
+        <w:t xml:space="preserve">section in</w:t>
+      </w:r>
+      <w:r>
+        <w:t xml:space="preserve"> </w:t>
+      </w:r>
+      <w:r>
+        <w:rPr>
+          <w:rStyle w:val="VerbatimChar"/>
+        </w:rPr>
+        <w:t xml:space="preserve">Architecture.md</w:t>
+      </w:r>
+      <w:r>
+        <w:t xml:space="preserve">); the unit-change test passes (results invariant under correct</w:t>
+      </w:r>
+      <w:r>
+        <w:t xml:space="preserve"> </w:t>
+      </w:r>
+      <w:r>
+        <w:t xml:space="preserve">conversion) for ≥1 DATA3 sheet; any mismatch found is documented and (if DATA3-only) fixed.</w:t>
+      </w:r>
+    </w:p>
+    <w:p>
+      <w:r>
+        <w:pict>
+          <v:rect style="width:0;height:1.5pt" o:hralign="center" o:hrstd="t" o:hr="t"/>
+        </w:pict>
+      </w:r>
+    </w:p>
+    <w:bookmarkEnd w:id="20"/>
+    <w:bookmarkStart w:id="21" w:name="verification-checklist-run-at-the-end"/>
+    <w:p>
+      <w:pPr>
+        <w:pStyle w:val="Heading2"/>
+      </w:pPr>
+      <w:r>
+        <w:t xml:space="preserve">Verification checklist (run at the end)</w:t>
+      </w:r>
+    </w:p>
+    <w:p>
+      <w:pPr>
+        <w:pStyle w:val="Compact"/>
+        <w:numPr>
+          <w:ilvl w:val="0"/>
+          <w:numId w:val="1021"/>
+        </w:numPr>
+      </w:pPr>
+      <w:r>
+        <w:rPr>
+          <w:rStyle w:val="VerbatimChar"/>
+        </w:rPr>
+        <w:t xml:space="preserve">pytest</w:t>
+      </w:r>
+      <w:r>
+        <w:t xml:space="preserve"> </w:t>
+      </w:r>
+      <w:r>
+        <w:t xml:space="preserve">DATA1 + DATA2 smoke/paper-comparison green (DATA1/DATA2 untouched).</w:t>
+      </w:r>
+    </w:p>
+    <w:p>
+      <w:pPr>
+        <w:pStyle w:val="Compact"/>
+        <w:numPr>
+          <w:ilvl w:val="0"/>
+          <w:numId w:val="1021"/>
+        </w:numPr>
+      </w:pPr>
+      <w:r>
+        <w:t xml:space="preserve">Per-sheet concentration-range table (Task 4) emitted as CSV + markdown for each DATA3 sheet.</w:t>
+      </w:r>
+    </w:p>
+    <w:p>
+      <w:pPr>
+        <w:pStyle w:val="Compact"/>
+        <w:numPr>
+          <w:ilvl w:val="0"/>
+          <w:numId w:val="1021"/>
+        </w:numPr>
+      </w:pPr>
+      <w:r>
         <w:t xml:space="preserve">WSSE σ×B contours (Task 5) rendered per response channel for a representative sheet, matching</w:t>
       </w:r>
       <w:r>
@@ -4705,7 +5814,7 @@
         <w:pStyle w:val="Compact"/>
         <w:numPr>
           <w:ilvl w:val="0"/>
-          <w:numId w:val="1018"/>
+          <w:numId w:val="1021"/>
         </w:numPr>
       </w:pPr>
       <w:r>
@@ -4723,7 +5832,7 @@
         <w:pStyle w:val="Compact"/>
         <w:numPr>
           <w:ilvl w:val="0"/>
-          <w:numId w:val="1018"/>
+          <w:numId w:val="1021"/>
         </w:numPr>
       </w:pPr>
       <w:r>
@@ -4741,7 +5850,7 @@
         <w:pStyle w:val="Compact"/>
         <w:numPr>
           <w:ilvl w:val="0"/>
-          <w:numId w:val="1018"/>
+          <w:numId w:val="1021"/>
         </w:numPr>
       </w:pPr>
       <w:r>
@@ -4765,7 +5874,7 @@
         <w:pStyle w:val="Compact"/>
         <w:numPr>
           <w:ilvl w:val="0"/>
-          <w:numId w:val="1018"/>
+          <w:numId w:val="1021"/>
         </w:numPr>
       </w:pPr>
       <w:r>
@@ -4789,7 +5898,25 @@
         <w:pStyle w:val="Compact"/>
         <w:numPr>
           <w:ilvl w:val="0"/>
-          <w:numId w:val="1018"/>
+          <w:numId w:val="1021"/>
+        </w:numPr>
+      </w:pPr>
+      <w:r>
+        <w:t xml:space="preserve">Units audit (Task 10): units table + term-by-term consistency report committed; unit-change</w:t>
+      </w:r>
+      <w:r>
+        <w:t xml:space="preserve"> </w:t>
+      </w:r>
+      <w:r>
+        <w:t xml:space="preserve">sensitivity test passes (fit + WSSE invariant under correct conversion) for ≥1 DATA3 sheet.</w:t>
+      </w:r>
+    </w:p>
+    <w:p>
+      <w:pPr>
+        <w:pStyle w:val="Compact"/>
+        <w:numPr>
+          <w:ilvl w:val="0"/>
+          <w:numId w:val="1021"/>
         </w:numPr>
       </w:pPr>
       <w:r>
@@ -4801,7 +5928,7 @@
         <w:pStyle w:val="Compact"/>
         <w:numPr>
           <w:ilvl w:val="0"/>
-          <w:numId w:val="1018"/>
+          <w:numId w:val="1021"/>
         </w:numPr>
       </w:pPr>
       <w:r>
@@ -4819,7 +5946,7 @@
         <w:pStyle w:val="Compact"/>
         <w:numPr>
           <w:ilvl w:val="0"/>
-          <w:numId w:val="1018"/>
+          <w:numId w:val="1021"/>
         </w:numPr>
       </w:pPr>
       <w:r>
@@ -4835,8 +5962,8 @@
         <w:t xml:space="preserve">updated with the new time-correction config + plotting helpers.</w:t>
       </w:r>
     </w:p>
-    <w:bookmarkEnd w:id="20"/>
-    <w:bookmarkStart w:id="21" w:name="assumptions-baked-in-change-if-wrong"/>
+    <w:bookmarkEnd w:id="21"/>
+    <w:bookmarkStart w:id="22" w:name="assumptions-baked-in-change-if-wrong"/>
     <w:p>
       <w:pPr>
         <w:pStyle w:val="Heading2"/>
@@ -4850,7 +5977,7 @@
         <w:pStyle w:val="Compact"/>
         <w:numPr>
           <w:ilvl w:val="0"/>
-          <w:numId w:val="1019"/>
+          <w:numId w:val="1022"/>
         </w:numPr>
       </w:pPr>
       <w:r>
@@ -4878,7 +6005,7 @@
         <w:pStyle w:val="Compact"/>
         <w:numPr>
           <w:ilvl w:val="0"/>
-          <w:numId w:val="1019"/>
+          <w:numId w:val="1022"/>
         </w:numPr>
       </w:pPr>
       <w:r>
@@ -4915,7 +6042,7 @@
         <w:pStyle w:val="Compact"/>
         <w:numPr>
           <w:ilvl w:val="0"/>
-          <w:numId w:val="1019"/>
+          <w:numId w:val="1022"/>
         </w:numPr>
       </w:pPr>
       <w:r>
@@ -4928,8 +6055,8 @@
         <w:t xml:space="preserve">comparison; split if it gets crowded.</w:t>
       </w:r>
     </w:p>
-    <w:bookmarkEnd w:id="21"/>
     <w:bookmarkEnd w:id="22"/>
+    <w:bookmarkEnd w:id="23"/>
     <w:sectPr>
       <w:footnotePr>
         <w:numRestart w:val="eachSect"/>
@@ -5391,9 +6518,45 @@
     <w:abstractNumId w:val="991"/>
   </w:num>
   <w:num w:numId="1018">
+    <w:abstractNumId w:val="99411"/>
+    <w:lvlOverride w:ilvl="0">
+      <w:startOverride w:val="1"/>
+    </w:lvlOverride>
+    <w:lvlOverride w:ilvl="1">
+      <w:startOverride w:val="1"/>
+    </w:lvlOverride>
+    <w:lvlOverride w:ilvl="2">
+      <w:startOverride w:val="1"/>
+    </w:lvlOverride>
+    <w:lvlOverride w:ilvl="3">
+      <w:startOverride w:val="1"/>
+    </w:lvlOverride>
+    <w:lvlOverride w:ilvl="4">
+      <w:startOverride w:val="1"/>
+    </w:lvlOverride>
+    <w:lvlOverride w:ilvl="5">
+      <w:startOverride w:val="1"/>
+    </w:lvlOverride>
+    <w:lvlOverride w:ilvl="6">
+      <w:startOverride w:val="1"/>
+    </w:lvlOverride>
+    <w:lvlOverride w:ilvl="7">
+      <w:startOverride w:val="1"/>
+    </w:lvlOverride>
+    <w:lvlOverride w:ilvl="8">
+      <w:startOverride w:val="1"/>
+    </w:lvlOverride>
+  </w:num>
+  <w:num w:numId="1019">
     <w:abstractNumId w:val="991"/>
   </w:num>
-  <w:num w:numId="1019">
+  <w:num w:numId="1020">
+    <w:abstractNumId w:val="991"/>
+  </w:num>
+  <w:num w:numId="1021">
+    <w:abstractNumId w:val="991"/>
+  </w:num>
+  <w:num w:numId="1022">
     <w:abstractNumId w:val="991"/>
   </w:num>
 </w:numbering>

</xml_diff>

<commit_message>
Prompt doc: Task 3 — split retentate/permeate into separate figures (8 plots)
Points 2/3/4 each get their own retentate and permeate figure: mass (1), ICP ret + ICP perm
(2), conductivity-probe ret + perm (2), conductivity-derived conc ret + perm (2), applied
pressure (1) = 8 separate per-experiment figures. Updated implementation note + assumptions.

Co-Authored-By: Claude Opus 4.8 <noreply@anthropic.com>
</commit_message>
<xml_diff>
--- a/refactored_codes_v1/PROMPT_loader_timecorr_and_plots.docx
+++ b/refactored_codes_v1/PROMPT_loader_timecorr_and_plots.docx
@@ -1165,13 +1165,13 @@
       </w:r>
     </w:p>
     <w:bookmarkEnd w:id="12"/>
-    <w:bookmarkStart w:id="13" w:name="X3eaf21447642bd198ba0e0452a2b6c4a2bd026b"/>
+    <w:bookmarkStart w:id="13" w:name="Xc2380870d01153add337c552298da685554f68b"/>
     <w:p>
       <w:pPr>
         <w:pStyle w:val="Heading2"/>
       </w:pPr>
       <w:r>
-        <w:t xml:space="preserve">Task 3 — New per-experiment prediction-fit figure set (5 quantities)</w:t>
+        <w:t xml:space="preserve">Task 3 — New per-experiment prediction-fit figure set (8 plots)</w:t>
       </w:r>
     </w:p>
     <w:p>
@@ -1179,7 +1179,23 @@
         <w:pStyle w:val="FirstParagraph"/>
       </w:pPr>
       <w:r>
-        <w:t xml:space="preserve">For each experiment (per sheet/run), produce a set of time-series figures comparing</w:t>
+        <w:t xml:space="preserve">For each experiment (per sheet/run), produce</w:t>
+      </w:r>
+      <w:r>
+        <w:t xml:space="preserve"> </w:t>
+      </w:r>
+      <w:r>
+        <w:rPr>
+          <w:b/>
+          <w:bCs/>
+        </w:rPr>
+        <w:t xml:space="preserve">8 separate time-series figures</w:t>
+      </w:r>
+      <w:r>
+        <w:t xml:space="preserve"> </w:t>
+      </w:r>
+      <w:r>
+        <w:t xml:space="preserve">comparing</w:t>
       </w:r>
       <w:r>
         <w:t xml:space="preserve"> </w:t>
@@ -1200,7 +1216,37 @@
         <w:t xml:space="preserve"> </w:t>
       </w:r>
       <w:r>
-        <w:t xml:space="preserve">and the Task-2 legend handling:</w:t>
+        <w:t xml:space="preserve">and the Task-2 legend handling.</w:t>
+      </w:r>
+      <w:r>
+        <w:t xml:space="preserve"> </w:t>
+      </w:r>
+      <w:r>
+        <w:rPr>
+          <w:b/>
+          <w:bCs/>
+        </w:rPr>
+        <w:t xml:space="preserve">Retentate and</w:t>
+      </w:r>
+      <w:r>
+        <w:rPr>
+          <w:b/>
+          <w:bCs/>
+        </w:rPr>
+        <w:t xml:space="preserve"> </w:t>
+      </w:r>
+      <w:r>
+        <w:rPr>
+          <w:b/>
+          <w:bCs/>
+        </w:rPr>
+        <w:t xml:space="preserve">permeate each get their own figure</w:t>
+      </w:r>
+      <w:r>
+        <w:t xml:space="preserve"> </w:t>
+      </w:r>
+      <w:r>
+        <w:t xml:space="preserve">for the concentration/conductivity quantities:</w:t>
       </w:r>
     </w:p>
     <w:p>
@@ -1238,13 +1284,7 @@
           <w:b/>
           <w:bCs/>
         </w:rPr>
-        <w:t xml:space="preserve">ICP concentrations vs time</w:t>
-      </w:r>
-      <w:r>
-        <w:t xml:space="preserve"> </w:t>
-      </w:r>
-      <w:r>
-        <w:t xml:space="preserve">— retentate and permeate ICP points (separate figure).</w:t>
+        <w:t xml:space="preserve">ICP retentate concentration vs time.</w:t>
       </w:r>
     </w:p>
     <w:p>
@@ -1260,28 +1300,7 @@
           <w:b/>
           <w:bCs/>
         </w:rPr>
-        <w:t xml:space="preserve">Conductivity-probe signal vs time</w:t>
-      </w:r>
-      <w:r>
-        <w:t xml:space="preserve"> </w:t>
-      </w:r>
-      <w:r>
-        <w:t xml:space="preserve">— raw probe trace for retentate and permeate</w:t>
-      </w:r>
-      <w:r>
-        <w:t xml:space="preserve"> </w:t>
-      </w:r>
-      <w:r>
-        <w:t xml:space="preserve">(separate figure). Find the raw conductivity time series in the loader/</w:t>
-      </w:r>
-      <w:r>
-        <w:rPr>
-          <w:rStyle w:val="VerbatimChar"/>
-        </w:rPr>
-        <w:t xml:space="preserve">data_stru</w:t>
-      </w:r>
-      <w:r>
-        <w:t xml:space="preserve">.</w:t>
+        <w:t xml:space="preserve">ICP permeate concentration vs time.</w:t>
       </w:r>
     </w:p>
     <w:p>
@@ -1297,86 +1316,31 @@
           <w:b/>
           <w:bCs/>
         </w:rPr>
-        <w:t xml:space="preserve">Conductivity-derived concentration vs time</w:t>
-      </w:r>
-      <w:r>
-        <w:t xml:space="preserve"> </w:t>
-      </w:r>
-      <w:r>
-        <w:t xml:space="preserve">— convert the probe conductivity to</w:t>
-      </w:r>
-      <w:r>
-        <w:t xml:space="preserve"> </w:t>
-      </w:r>
-      <w:r>
-        <w:t xml:space="preserve">concentration using</w:t>
-      </w:r>
-      <w:r>
-        <w:t xml:space="preserve"> </w:t>
-      </w:r>
-      <w:r>
-        <w:rPr>
-          <w:rStyle w:val="VerbatimChar"/>
-        </w:rPr>
-        <w:t xml:space="preserve">conductivity_paper.py</w:t>
-      </w:r>
-      <w:r>
-        <w:t xml:space="preserve"> </w:t>
-      </w:r>
-      <w:r>
-        <w:t xml:space="preserve">(</w:t>
-      </w:r>
-      <w:r>
-        <w:rPr>
-          <w:b/>
-          <w:bCs/>
-        </w:rPr>
-        <w:t xml:space="preserve">invert</w:t>
-      </w:r>
-      <w:r>
-        <w:t xml:space="preserve"> </w:t>
-      </w:r>
-      <w:r>
-        <w:rPr>
-          <w:rStyle w:val="VerbatimChar"/>
-        </w:rPr>
-        <w:t xml:space="preserve">variant_shedlovsky</w:t>
-      </w:r>
-      <w:r>
-        <w:t xml:space="preserve"> </w:t>
-      </w:r>
-      <w:r>
-        <w:t xml:space="preserve">per point with a</w:t>
-      </w:r>
-      <w:r>
-        <w:t xml:space="preserve"> </w:t>
-      </w:r>
-      <w:r>
-        <w:t xml:space="preserve">root-find such as</w:t>
-      </w:r>
-      <w:r>
-        <w:t xml:space="preserve"> </w:t>
-      </w:r>
-      <w:r>
-        <w:rPr>
-          <w:rStyle w:val="VerbatimChar"/>
-        </w:rPr>
-        <w:t xml:space="preserve">scipy.optimize.bisect</w:t>
-      </w:r>
-      <w:r>
-        <w:t xml:space="preserve">, using the salt-specific parameters), plotted for</w:t>
-      </w:r>
-      <w:r>
-        <w:t xml:space="preserve"> </w:t>
-      </w:r>
-      <w:r>
-        <w:t xml:space="preserve">retentate and permeate (separate figure). Note in code how this compares to the loader's</w:t>
-      </w:r>
-      <w:r>
-        <w:t xml:space="preserve"> </w:t>
-      </w:r>
-      <w:r>
-        <w:t xml:space="preserve">existing conductivity→concentration conversion.</w:t>
+        <w:t xml:space="preserve">Conductivity-probe signal vs time — retentate</w:t>
+      </w:r>
+      <w:r>
+        <w:t xml:space="preserve"> </w:t>
+      </w:r>
+      <w:r>
+        <w:t xml:space="preserve">(raw probe trace; find the series in the</w:t>
+      </w:r>
+      <w:r>
+        <w:t xml:space="preserve"> </w:t>
+      </w:r>
+      <w:r>
+        <w:t xml:space="preserve">loader /</w:t>
+      </w:r>
+      <w:r>
+        <w:t xml:space="preserve"> </w:t>
+      </w:r>
+      <w:r>
+        <w:rPr>
+          <w:rStyle w:val="VerbatimChar"/>
+        </w:rPr>
+        <w:t xml:space="preserve">data_stru</w:t>
+      </w:r>
+      <w:r>
+        <w:t xml:space="preserve">).</w:t>
       </w:r>
     </w:p>
     <w:p>
@@ -1392,18 +1356,147 @@
           <w:b/>
           <w:bCs/>
         </w:rPr>
-        <w:t xml:space="preserve">Applied pressure (ΔP) vs time</w:t>
-      </w:r>
-      <w:r>
-        <w:t xml:space="preserve"> </w:t>
-      </w:r>
-      <w:r>
-        <w:t xml:space="preserve">— separate figure.</w:t>
+        <w:t xml:space="preserve">Conductivity-probe signal vs time — permeate.</w:t>
+      </w:r>
+    </w:p>
+    <w:p>
+      <w:pPr>
+        <w:pStyle w:val="Compact"/>
+        <w:numPr>
+          <w:ilvl w:val="0"/>
+          <w:numId w:val="1007"/>
+        </w:numPr>
+      </w:pPr>
+      <w:r>
+        <w:rPr>
+          <w:b/>
+          <w:bCs/>
+        </w:rPr>
+        <w:t xml:space="preserve">Conductivity-derived concentration vs time — retentate</w:t>
+      </w:r>
+      <w:r>
+        <w:t xml:space="preserve"> </w:t>
+      </w:r>
+      <w:r>
+        <w:t xml:space="preserve">— convert the probe conductivity to</w:t>
+      </w:r>
+      <w:r>
+        <w:t xml:space="preserve"> </w:t>
+      </w:r>
+      <w:r>
+        <w:t xml:space="preserve">concentration via</w:t>
+      </w:r>
+      <w:r>
+        <w:t xml:space="preserve"> </w:t>
+      </w:r>
+      <w:r>
+        <w:rPr>
+          <w:rStyle w:val="VerbatimChar"/>
+        </w:rPr>
+        <w:t xml:space="preserve">conductivity_paper.py</w:t>
+      </w:r>
+      <w:r>
+        <w:t xml:space="preserve"> </w:t>
+      </w:r>
+      <w:r>
+        <w:t xml:space="preserve">(</w:t>
+      </w:r>
+      <w:r>
+        <w:rPr>
+          <w:b/>
+          <w:bCs/>
+        </w:rPr>
+        <w:t xml:space="preserve">invert</w:t>
+      </w:r>
+      <w:r>
+        <w:t xml:space="preserve"> </w:t>
+      </w:r>
+      <w:r>
+        <w:rPr>
+          <w:rStyle w:val="VerbatimChar"/>
+        </w:rPr>
+        <w:t xml:space="preserve">variant_shedlovsky</w:t>
+      </w:r>
+      <w:r>
+        <w:t xml:space="preserve"> </w:t>
+      </w:r>
+      <w:r>
+        <w:t xml:space="preserve">per point with a</w:t>
+      </w:r>
+      <w:r>
+        <w:t xml:space="preserve"> </w:t>
+      </w:r>
+      <w:r>
+        <w:t xml:space="preserve">root-find such as</w:t>
+      </w:r>
+      <w:r>
+        <w:t xml:space="preserve"> </w:t>
+      </w:r>
+      <w:r>
+        <w:rPr>
+          <w:rStyle w:val="VerbatimChar"/>
+        </w:rPr>
+        <w:t xml:space="preserve">scipy.optimize.bisect</w:t>
+      </w:r>
+      <w:r>
+        <w:t xml:space="preserve">, using the salt-specific parameters).</w:t>
+      </w:r>
+    </w:p>
+    <w:p>
+      <w:pPr>
+        <w:pStyle w:val="Compact"/>
+        <w:numPr>
+          <w:ilvl w:val="0"/>
+          <w:numId w:val="1007"/>
+        </w:numPr>
+      </w:pPr>
+      <w:r>
+        <w:rPr>
+          <w:b/>
+          <w:bCs/>
+        </w:rPr>
+        <w:t xml:space="preserve">Conductivity-derived concentration vs time — permeate</w:t>
+      </w:r>
+      <w:r>
+        <w:t xml:space="preserve"> </w:t>
+      </w:r>
+      <w:r>
+        <w:t xml:space="preserve">(same inversion).</w:t>
+      </w:r>
+    </w:p>
+    <w:p>
+      <w:pPr>
+        <w:pStyle w:val="Compact"/>
+        <w:numPr>
+          <w:ilvl w:val="0"/>
+          <w:numId w:val="1007"/>
+        </w:numPr>
+      </w:pPr>
+      <w:r>
+        <w:rPr>
+          <w:b/>
+          <w:bCs/>
+        </w:rPr>
+        <w:t xml:space="preserve">Applied pressure (ΔP) vs time.</w:t>
       </w:r>
     </w:p>
     <w:p>
       <w:pPr>
         <w:pStyle w:val="FirstParagraph"/>
+      </w:pPr>
+      <w:r>
+        <w:t xml:space="preserve">Note in code how the conductivity-derived concentrations (plots 6 &amp; 7) compare to the loader's</w:t>
+      </w:r>
+      <w:r>
+        <w:t xml:space="preserve"> </w:t>
+      </w:r>
+      <w:r>
+        <w:t xml:space="preserve">existing conductivity→concentration conversion.</w:t>
+      </w:r>
+    </w:p>
+    <w:p>
+      <w:pPr>
+        <w:pStyle w:val="BodyText"/>
       </w:pPr>
       <w:r>
         <w:t xml:space="preserve">Implementation notes:</w:t>
@@ -1454,13 +1547,23 @@
         </w:numPr>
       </w:pPr>
       <w:r>
-        <w:t xml:space="preserve">One figure per quantity per experiment (separate files), saved under the predictions output</w:t>
-      </w:r>
-      <w:r>
-        <w:t xml:space="preserve"> </w:t>
-      </w:r>
-      <w:r>
-        <w:t xml:space="preserve">dir;</w:t>
+        <w:rPr>
+          <w:b/>
+          <w:bCs/>
+        </w:rPr>
+        <w:t xml:space="preserve">8 separate figure files per experiment</w:t>
+      </w:r>
+      <w:r>
+        <w:t xml:space="preserve"> </w:t>
+      </w:r>
+      <w:r>
+        <w:t xml:space="preserve">(one per plot above), saved under the predictions</w:t>
+      </w:r>
+      <w:r>
+        <w:t xml:space="preserve"> </w:t>
+      </w:r>
+      <w:r>
+        <w:t xml:space="preserve">output dir;</w:t>
       </w:r>
       <w:r>
         <w:t xml:space="preserve"> </w:t>
@@ -1527,19 +1630,35 @@
         <w:t xml:space="preserve"> </w:t>
       </w:r>
       <w:r>
-        <w:t xml:space="preserve">Render the 5 figures for one representative DATA3 sheet (e.g. a concentrating</w:t>
-      </w:r>
-      <w:r>
-        <w:t xml:space="preserve"> </w:t>
-      </w:r>
-      <w:r>
-        <w:t xml:space="preserve">CaCl₂ run); verify each is readable, legend-clear, DATA2-styled, and that the</w:t>
-      </w:r>
-      <w:r>
-        <w:t xml:space="preserve"> </w:t>
-      </w:r>
-      <w:r>
-        <w:t xml:space="preserve">conductivity-derived concentration tracks the ICP points sensibly.</w:t>
+        <w:t xml:space="preserve">Render all</w:t>
+      </w:r>
+      <w:r>
+        <w:t xml:space="preserve"> </w:t>
+      </w:r>
+      <w:r>
+        <w:rPr>
+          <w:b/>
+          <w:bCs/>
+        </w:rPr>
+        <w:t xml:space="preserve">8 figures</w:t>
+      </w:r>
+      <w:r>
+        <w:t xml:space="preserve"> </w:t>
+      </w:r>
+      <w:r>
+        <w:t xml:space="preserve">for one representative DATA3 sheet (e.g. a concentrating</w:t>
+      </w:r>
+      <w:r>
+        <w:t xml:space="preserve"> </w:t>
+      </w:r>
+      <w:r>
+        <w:t xml:space="preserve">CaCl₂ run); verify each is readable, legend-clear, DATA2-styled, and that the retentate/permeate</w:t>
+      </w:r>
+      <w:r>
+        <w:t xml:space="preserve"> </w:t>
+      </w:r>
+      <w:r>
+        <w:t xml:space="preserve">conductivity-derived concentrations track their respective ICP points sensibly.</w:t>
       </w:r>
     </w:p>
     <w:p>
@@ -5981,23 +6100,29 @@
         </w:numPr>
       </w:pPr>
       <w:r>
-        <w:t xml:space="preserve">Task 3 figures are</w:t>
-      </w:r>
-      <w:r>
-        <w:t xml:space="preserve"> </w:t>
-      </w:r>
-      <w:r>
-        <w:rPr>
-          <w:b/>
-          <w:bCs/>
-        </w:rPr>
-        <w:t xml:space="preserve">separate files per quantity per experiment</w:t>
-      </w:r>
-      <w:r>
-        <w:t xml:space="preserve"> </w:t>
-      </w:r>
-      <w:r>
-        <w:t xml:space="preserve">(+ optional combined panel).</w:t>
+        <w:t xml:space="preserve">Task 3 produces</w:t>
+      </w:r>
+      <w:r>
+        <w:t xml:space="preserve"> </w:t>
+      </w:r>
+      <w:r>
+        <w:rPr>
+          <w:b/>
+          <w:bCs/>
+        </w:rPr>
+        <w:t xml:space="preserve">8 separate figure files per experiment</w:t>
+      </w:r>
+      <w:r>
+        <w:t xml:space="preserve"> </w:t>
+      </w:r>
+      <w:r>
+        <w:t xml:space="preserve">(retentate and permeate split for the</w:t>
+      </w:r>
+      <w:r>
+        <w:t xml:space="preserve"> </w:t>
+      </w:r>
+      <w:r>
+        <w:t xml:space="preserve">ICP, conductivity-probe, and conductivity-derived-concentration quantities) + optional combined panel.</w:t>
       </w:r>
     </w:p>
     <w:p>
@@ -6035,24 +6160,6 @@
       </w:r>
       <w:r>
         <w:t xml:space="preserve">inversion for now.</w:t>
-      </w:r>
-    </w:p>
-    <w:p>
-      <w:pPr>
-        <w:pStyle w:val="Compact"/>
-        <w:numPr>
-          <w:ilvl w:val="0"/>
-          <w:numId w:val="1022"/>
-        </w:numPr>
-      </w:pPr>
-      <w:r>
-        <w:t xml:space="preserve">"Concentration vs time" plots cover both retentate and permeate on shared axes where it aids</w:t>
-      </w:r>
-      <w:r>
-        <w:t xml:space="preserve"> </w:t>
-      </w:r>
-      <w:r>
-        <w:t xml:space="preserve">comparison; split if it gets crowded.</w:t>
       </w:r>
     </w:p>
     <w:bookmarkEnd w:id="22"/>

</xml_diff>

<commit_message>
Prompt doc: split Task 5 ret/permeate channels (7 contours) + add Task 11 (selectable cond<->conc converter)
Task 5 mirrors the Task-3 split: mass + ICP-ret + ICP-perm + cond-probe-ret/perm + cond-derived-ret/perm
= 7 per-channel WSSE contours (DP excluded). New Task 11: a single conductivity<->concentration
converter with selectable backend (Shedlovsky / MSA / DATA2 model), used by Tasks 3/5/8/9; Task 3
plots 6-7 now route through it.

Co-Authored-By: Claude Opus 4.8 <noreply@anthropic.com>
</commit_message>
<xml_diff>
--- a/refactored_codes_v1/PROMPT_loader_timecorr_and_plots.docx
+++ b/refactored_codes_v1/PROMPT_loader_timecorr_and_plots.docx
@@ -2,7 +2,7 @@
 <file path=word/document.xml><?xml version="1.0" encoding="utf-8"?>
 <w:document xmlns:w="http://schemas.openxmlformats.org/wordprocessingml/2006/main" xmlns:m="http://schemas.openxmlformats.org/officeDocument/2006/math" xmlns:r="http://schemas.openxmlformats.org/officeDocument/2006/relationships" xmlns:o="urn:schemas-microsoft-com:office:office" xmlns:v="urn:schemas-microsoft-com:vml" xmlns:w10="urn:schemas-microsoft-com:office:word" xmlns:a="http://schemas.openxmlformats.org/drawingml/2006/main" xmlns:pic="http://schemas.openxmlformats.org/drawingml/2006/picture" xmlns:wp="http://schemas.openxmlformats.org/drawingml/2006/wordprocessingDrawing">
   <w:body>
-    <w:bookmarkStart w:id="23" w:name="Xba18ee4443b3365a6313bba308bae49ab6d4eed"/>
+    <w:bookmarkStart w:id="24" w:name="Xba18ee4443b3365a6313bba308bae49ab6d4eed"/>
     <w:p>
       <w:pPr>
         <w:pStyle w:val="Heading1"/>
@@ -1384,50 +1384,29 @@
         <w:t xml:space="preserve"> </w:t>
       </w:r>
       <w:r>
-        <w:t xml:space="preserve">concentration via</w:t>
-      </w:r>
-      <w:r>
-        <w:t xml:space="preserve"> </w:t>
-      </w:r>
-      <w:r>
-        <w:rPr>
-          <w:rStyle w:val="VerbatimChar"/>
-        </w:rPr>
-        <w:t xml:space="preserve">conductivity_paper.py</w:t>
-      </w:r>
-      <w:r>
-        <w:t xml:space="preserve"> </w:t>
-      </w:r>
-      <w:r>
-        <w:t xml:space="preserve">(</w:t>
-      </w:r>
-      <w:r>
-        <w:rPr>
-          <w:b/>
-          <w:bCs/>
-        </w:rPr>
-        <w:t xml:space="preserve">invert</w:t>
-      </w:r>
-      <w:r>
-        <w:t xml:space="preserve"> </w:t>
-      </w:r>
-      <w:r>
-        <w:rPr>
-          <w:rStyle w:val="VerbatimChar"/>
-        </w:rPr>
-        <w:t xml:space="preserve">variant_shedlovsky</w:t>
-      </w:r>
-      <w:r>
-        <w:t xml:space="preserve"> </w:t>
-      </w:r>
-      <w:r>
-        <w:t xml:space="preserve">per point with a</w:t>
-      </w:r>
-      <w:r>
-        <w:t xml:space="preserve"> </w:t>
-      </w:r>
-      <w:r>
-        <w:t xml:space="preserve">root-find such as</w:t>
+        <w:t xml:space="preserve">concentration via the</w:t>
+      </w:r>
+      <w:r>
+        <w:t xml:space="preserve"> </w:t>
+      </w:r>
+      <w:r>
+        <w:rPr>
+          <w:b/>
+          <w:bCs/>
+        </w:rPr>
+        <w:t xml:space="preserve">selectable converter (Task 11)</w:t>
+      </w:r>
+      <w:r>
+        <w:t xml:space="preserve"> </w:t>
+      </w:r>
+      <w:r>
+        <w:t xml:space="preserve">— Shedlovsky / MSA / DATA2 model — each</w:t>
+      </w:r>
+      <w:r>
+        <w:t xml:space="preserve"> </w:t>
+      </w:r>
+      <w:r>
+        <w:t xml:space="preserve">inverted per point with a root-find such as</w:t>
       </w:r>
       <w:r>
         <w:t xml:space="preserve"> </w:t>
@@ -1439,7 +1418,7 @@
         <w:t xml:space="preserve">scipy.optimize.bisect</w:t>
       </w:r>
       <w:r>
-        <w:t xml:space="preserve">, using the salt-specific parameters).</w:t>
+        <w:t xml:space="preserve">, using salt-specific params.</w:t>
       </w:r>
     </w:p>
     <w:p>
@@ -1461,7 +1440,7 @@
         <w:t xml:space="preserve"> </w:t>
       </w:r>
       <w:r>
-        <w:t xml:space="preserve">(same inversion).</w:t>
+        <w:t xml:space="preserve">(same conversion).</w:t>
       </w:r>
     </w:p>
     <w:p>
@@ -2206,7 +2185,42 @@
         <w:t xml:space="preserve"> </w:t>
       </w:r>
       <w:r>
-        <w:t xml:space="preserve">from Task 3. Produce one contour per channel:</w:t>
+        <w:t xml:space="preserve">from Task 3,</w:t>
+      </w:r>
+      <w:r>
+        <w:t xml:space="preserve"> </w:t>
+      </w:r>
+      <w:r>
+        <w:rPr>
+          <w:b/>
+          <w:bCs/>
+        </w:rPr>
+        <w:t xml:space="preserve">each as its own contour</w:t>
+      </w:r>
+      <w:r>
+        <w:t xml:space="preserve"> </w:t>
+      </w:r>
+      <w:r>
+        <w:t xml:space="preserve">(retentate and permeate split,</w:t>
+      </w:r>
+      <w:r>
+        <w:t xml:space="preserve"> </w:t>
+      </w:r>
+      <w:r>
+        <w:t xml:space="preserve">mirroring the Task-3 8-plot layout). One contour per channel —</w:t>
+      </w:r>
+      <w:r>
+        <w:t xml:space="preserve"> </w:t>
+      </w:r>
+      <w:r>
+        <w:rPr>
+          <w:b/>
+          <w:bCs/>
+        </w:rPr>
+        <w:t xml:space="preserve">7 channels</w:t>
+      </w:r>
+      <w:r>
+        <w:t xml:space="preserve">:</w:t>
       </w:r>
     </w:p>
     <w:p>
@@ -2244,7 +2258,7 @@
           <w:b/>
           <w:bCs/>
         </w:rPr>
-        <w:t xml:space="preserve">ICP retentate + permeate concentration.</w:t>
+        <w:t xml:space="preserve">ICP retentate concentration.</w:t>
       </w:r>
     </w:p>
     <w:p>
@@ -2260,47 +2274,7 @@
           <w:b/>
           <w:bCs/>
         </w:rPr>
-        <w:t xml:space="preserve">Conductivity-probe signal</w:t>
-      </w:r>
-      <w:r>
-        <w:t xml:space="preserve"> </w:t>
-      </w:r>
-      <w:r>
-        <w:t xml:space="preserve">(retentate + permeate) — WSSE computed</w:t>
-      </w:r>
-      <w:r>
-        <w:t xml:space="preserve"> </w:t>
-      </w:r>
-      <w:r>
-        <w:rPr>
-          <w:b/>
-          <w:bCs/>
-        </w:rPr>
-        <w:t xml:space="preserve">in conductivity space</w:t>
-      </w:r>
-      <w:r>
-        <w:t xml:space="preserve">:</w:t>
-      </w:r>
-      <w:r>
-        <w:t xml:space="preserve"> </w:t>
-      </w:r>
-      <w:r>
-        <w:t xml:space="preserve">map the model concentration → predicted conductivity via</w:t>
-      </w:r>
-      <w:r>
-        <w:t xml:space="preserve"> </w:t>
-      </w:r>
-      <w:r>
-        <w:rPr>
-          <w:rStyle w:val="VerbatimChar"/>
-        </w:rPr>
-        <w:t xml:space="preserve">conductivity_paper.variant_shedlovsky(...)</w:t>
-      </w:r>
-      <w:r>
-        <w:t xml:space="preserve"> </w:t>
-      </w:r>
-      <w:r>
-        <w:t xml:space="preserve">and compare to the measured probe trace.</w:t>
+        <w:t xml:space="preserve">ICP permeate concentration.</w:t>
       </w:r>
     </w:p>
     <w:p>
@@ -2316,29 +2290,84 @@
           <w:b/>
           <w:bCs/>
         </w:rPr>
-        <w:t xml:space="preserve">Conductivity-derived concentration</w:t>
-      </w:r>
-      <w:r>
-        <w:t xml:space="preserve"> </w:t>
-      </w:r>
-      <w:r>
-        <w:t xml:space="preserve">(retentate + permeate) — WSSE computed</w:t>
-      </w:r>
-      <w:r>
-        <w:t xml:space="preserve"> </w:t>
-      </w:r>
-      <w:r>
-        <w:rPr>
-          <w:b/>
-          <w:bCs/>
-        </w:rPr>
-        <w:t xml:space="preserve">in</w:t>
-      </w:r>
-      <w:r>
-        <w:rPr>
-          <w:b/>
-          <w:bCs/>
-        </w:rPr>
+        <w:t xml:space="preserve">Conductivity-probe — retentate</w:t>
+      </w:r>
+      <w:r>
+        <w:t xml:space="preserve"> </w:t>
+      </w:r>
+      <w:r>
+        <w:t xml:space="preserve">— WSSE in</w:t>
+      </w:r>
+      <w:r>
+        <w:t xml:space="preserve"> </w:t>
+      </w:r>
+      <w:r>
+        <w:rPr>
+          <w:b/>
+          <w:bCs/>
+        </w:rPr>
+        <w:t xml:space="preserve">conductivity space</w:t>
+      </w:r>
+      <w:r>
+        <w:t xml:space="preserve">: map the model concentration</w:t>
+      </w:r>
+      <w:r>
+        <w:t xml:space="preserve"> </w:t>
+      </w:r>
+      <w:r>
+        <w:t xml:space="preserve">→ predicted conductivity (via the selectable converter, Task 11) and compare to the measured</w:t>
+      </w:r>
+      <w:r>
+        <w:t xml:space="preserve"> </w:t>
+      </w:r>
+      <w:r>
+        <w:t xml:space="preserve">retentate probe trace.</w:t>
+      </w:r>
+    </w:p>
+    <w:p>
+      <w:pPr>
+        <w:pStyle w:val="Compact"/>
+        <w:numPr>
+          <w:ilvl w:val="0"/>
+          <w:numId w:val="1011"/>
+        </w:numPr>
+      </w:pPr>
+      <w:r>
+        <w:rPr>
+          <w:b/>
+          <w:bCs/>
+        </w:rPr>
+        <w:t xml:space="preserve">Conductivity-probe — permeate</w:t>
+      </w:r>
+      <w:r>
+        <w:t xml:space="preserve"> </w:t>
+      </w:r>
+      <w:r>
+        <w:t xml:space="preserve">— same, permeate side.</w:t>
+      </w:r>
+    </w:p>
+    <w:p>
+      <w:pPr>
+        <w:pStyle w:val="Compact"/>
+        <w:numPr>
+          <w:ilvl w:val="0"/>
+          <w:numId w:val="1011"/>
+        </w:numPr>
+      </w:pPr>
+      <w:r>
+        <w:rPr>
+          <w:b/>
+          <w:bCs/>
+        </w:rPr>
+        <w:t xml:space="preserve">Conductivity-derived concentration — retentate</w:t>
+      </w:r>
+      <w:r>
+        <w:t xml:space="preserve"> </w:t>
+      </w:r>
+      <w:r>
+        <w:t xml:space="preserve">— WSSE in</w:t>
+      </w:r>
+      <w:r>
         <w:t xml:space="preserve"> </w:t>
       </w:r>
       <w:r>
@@ -2349,13 +2378,41 @@
         <w:t xml:space="preserve">concentration space</w:t>
       </w:r>
       <w:r>
-        <w:t xml:space="preserve">: invert the probe conductivity → concentration (Task 3 inversion) and</w:t>
-      </w:r>
-      <w:r>
-        <w:t xml:space="preserve"> </w:t>
-      </w:r>
-      <w:r>
-        <w:t xml:space="preserve">compare to the model concentration.</w:t>
+        <w:t xml:space="preserve">: invert the</w:t>
+      </w:r>
+      <w:r>
+        <w:t xml:space="preserve"> </w:t>
+      </w:r>
+      <w:r>
+        <w:t xml:space="preserve">retentate probe conductivity → concentration (selectable converter, Task 11) and compare to the</w:t>
+      </w:r>
+      <w:r>
+        <w:t xml:space="preserve"> </w:t>
+      </w:r>
+      <w:r>
+        <w:t xml:space="preserve">model concentration.</w:t>
+      </w:r>
+    </w:p>
+    <w:p>
+      <w:pPr>
+        <w:pStyle w:val="Compact"/>
+        <w:numPr>
+          <w:ilvl w:val="0"/>
+          <w:numId w:val="1011"/>
+        </w:numPr>
+      </w:pPr>
+      <w:r>
+        <w:rPr>
+          <w:b/>
+          <w:bCs/>
+        </w:rPr>
+        <w:t xml:space="preserve">Conductivity-derived concentration — permeate</w:t>
+      </w:r>
+      <w:r>
+        <w:t xml:space="preserve"> </w:t>
+      </w:r>
+      <w:r>
+        <w:t xml:space="preserve">— same, permeate side.</w:t>
       </w:r>
     </w:p>
     <w:p>
@@ -2363,6 +2420,14 @@
         <w:pStyle w:val="FirstParagraph"/>
       </w:pPr>
       <w:r>
+        <w:t xml:space="preserve">(ΔP is excluded — control input, not a fitted response.)</w:t>
+      </w:r>
+    </w:p>
+    <w:p>
+      <w:pPr>
+        <w:pStyle w:val="BodyText"/>
+      </w:pPr>
+      <w:r>
         <w:t xml:space="preserve">Implementation:</w:t>
       </w:r>
     </w:p>
@@ -2506,7 +2571,7 @@
           <w:b/>
           <w:bCs/>
         </w:rPr>
-        <w:t xml:space="preserve">two new residual definitions</w:t>
+        <w:t xml:space="preserve">four new residual definitions</w:t>
       </w:r>
       <w:r>
         <w:t xml:space="preserve"> </w:t>
@@ -2518,29 +2583,32 @@
         <w:t xml:space="preserve"> </w:t>
       </w:r>
       <w:r>
-        <w:t xml:space="preserve">concentration-space); wire them in as additional per-response objective channels without</w:t>
-      </w:r>
-      <w:r>
-        <w:t xml:space="preserve"> </w:t>
-      </w:r>
-      <w:r>
-        <w:t xml:space="preserve">altering the existing mass/retentate/permeate channels.</w:t>
-      </w:r>
-    </w:p>
-    <w:p>
-      <w:pPr>
-        <w:pStyle w:val="Compact"/>
-        <w:numPr>
-          <w:ilvl w:val="0"/>
-          <w:numId w:val="1012"/>
-        </w:numPr>
-      </w:pPr>
-      <w:r>
-        <w:rPr>
-          <w:b/>
-          <w:bCs/>
-        </w:rPr>
-        <w:t xml:space="preserve">ΔP (applied pressure) is a control input, not a fitted response — no WSSE contour for it.</w:t>
+        <w:t xml:space="preserve">concentration-space, each split retentate / permeate); wire them in as additional per-response</w:t>
+      </w:r>
+      <w:r>
+        <w:t xml:space="preserve"> </w:t>
+      </w:r>
+      <w:r>
+        <w:t xml:space="preserve">objective channels without altering the existing mass/retentate/permeate channels. The</w:t>
+      </w:r>
+      <w:r>
+        <w:t xml:space="preserve"> </w:t>
+      </w:r>
+      <w:r>
+        <w:t xml:space="preserve">conductivity↔concentration mapping must go through the</w:t>
+      </w:r>
+      <w:r>
+        <w:t xml:space="preserve"> </w:t>
+      </w:r>
+      <w:r>
+        <w:rPr>
+          <w:b/>
+          <w:bCs/>
+        </w:rPr>
+        <w:t xml:space="preserve">selectable converter (Task 11)</w:t>
+      </w:r>
+      <w:r>
+        <w:t xml:space="preserve">.</w:t>
       </w:r>
     </w:p>
     <w:p>
@@ -2558,25 +2626,25 @@
         <w:t xml:space="preserve"> </w:t>
       </w:r>
       <w:r>
-        <w:t xml:space="preserve">A log-WSSE σ×B contour rendered per response channel for a representative DATA3</w:t>
-      </w:r>
-      <w:r>
-        <w:t xml:space="preserve"> </w:t>
-      </w:r>
-      <w:r>
-        <w:t xml:space="preserve">sheet, in the same style as the existing contours, with the optimum marker shown; confirm the</w:t>
-      </w:r>
-      <w:r>
-        <w:t xml:space="preserve"> </w:t>
-      </w:r>
-      <w:r>
-        <w:t xml:space="preserve">per-channel identifiability pattern (narrow valley in B, ~flat in σ) is consistent with the</w:t>
-      </w:r>
-      <w:r>
-        <w:t xml:space="preserve"> </w:t>
-      </w:r>
-      <w:r>
-        <w:t xml:space="preserve">established single-experiment finding.</w:t>
+        <w:t xml:space="preserve">A log-WSSE σ×B contour rendered for each of the 7 response channels for a</w:t>
+      </w:r>
+      <w:r>
+        <w:t xml:space="preserve"> </w:t>
+      </w:r>
+      <w:r>
+        <w:t xml:space="preserve">representative DATA3 sheet, in the same style as the existing contours, with the optimum marker</w:t>
+      </w:r>
+      <w:r>
+        <w:t xml:space="preserve"> </w:t>
+      </w:r>
+      <w:r>
+        <w:t xml:space="preserve">shown; confirm the per-channel identifiability pattern (narrow valley in B, ~flat in σ) is</w:t>
+      </w:r>
+      <w:r>
+        <w:t xml:space="preserve"> </w:t>
+      </w:r>
+      <w:r>
+        <w:t xml:space="preserve">consistent with the established single-experiment finding.</w:t>
       </w:r>
     </w:p>
     <w:p>
@@ -5868,12 +5936,430 @@
       </w:r>
     </w:p>
     <w:bookmarkEnd w:id="20"/>
-    <w:bookmarkStart w:id="21" w:name="verification-checklist-run-at-the-end"/>
+    <w:bookmarkStart w:id="21" w:name="X01e6a76ca80e63dc7dd1d27b0a55aec1df1bb90"/>
     <w:p>
       <w:pPr>
         <w:pStyle w:val="Heading2"/>
       </w:pPr>
       <w:r>
+        <w:t xml:space="preserve">Task 11 — Selectable conductivity ↔ concentration converter (Shedlovsky / MSA / DATA2)</w:t>
+      </w:r>
+    </w:p>
+    <w:p>
+      <w:pPr>
+        <w:pStyle w:val="FirstParagraph"/>
+      </w:pPr>
+      <w:r>
+        <w:rPr>
+          <w:b/>
+          <w:bCs/>
+        </w:rPr>
+        <w:t xml:space="preserve">Objective.</w:t>
+      </w:r>
+      <w:r>
+        <w:t xml:space="preserve"> </w:t>
+      </w:r>
+      <w:r>
+        <w:t xml:space="preserve">A single reusable converter between</w:t>
+      </w:r>
+      <w:r>
+        <w:t xml:space="preserve"> </w:t>
+      </w:r>
+      <w:r>
+        <w:rPr>
+          <w:b/>
+          <w:bCs/>
+        </w:rPr>
+        <w:t xml:space="preserve">conductivity and concentration</w:t>
+      </w:r>
+      <w:r>
+        <w:t xml:space="preserve"> </w:t>
+      </w:r>
+      <w:r>
+        <w:t xml:space="preserve">with a</w:t>
+      </w:r>
+      <w:r>
+        <w:t xml:space="preserve"> </w:t>
+      </w:r>
+      <w:r>
+        <w:rPr>
+          <w:b/>
+          <w:bCs/>
+        </w:rPr>
+        <w:t xml:space="preserve">selectable backend model</w:t>
+      </w:r>
+      <w:r>
+        <w:t xml:space="preserve">, so the conductivity-derived quantities (Tasks 3, 5, 8, 9) can be</w:t>
+      </w:r>
+      <w:r>
+        <w:t xml:space="preserve"> </w:t>
+      </w:r>
+      <w:r>
+        <w:t xml:space="preserve">computed under — and compared across — three models:</w:t>
+      </w:r>
+    </w:p>
+    <w:p>
+      <w:pPr>
+        <w:pStyle w:val="Compact"/>
+        <w:numPr>
+          <w:ilvl w:val="0"/>
+          <w:numId w:val="1021"/>
+        </w:numPr>
+      </w:pPr>
+      <w:r>
+        <w:rPr>
+          <w:rStyle w:val="VerbatimChar"/>
+          <w:b/>
+          <w:bCs/>
+        </w:rPr>
+        <w:t xml:space="preserve">"shedlovsky"</w:t>
+      </w:r>
+      <w:r>
+        <w:t xml:space="preserve"> </w:t>
+      </w:r>
+      <w:r>
+        <w:t xml:space="preserve">— invert</w:t>
+      </w:r>
+      <w:r>
+        <w:t xml:space="preserve"> </w:t>
+      </w:r>
+      <w:r>
+        <w:rPr>
+          <w:rStyle w:val="VerbatimChar"/>
+        </w:rPr>
+        <w:t xml:space="preserve">conductivity_paper.variant_shedlovsky(...)</w:t>
+      </w:r>
+      <w:r>
+        <w:t xml:space="preserve"> </w:t>
+      </w:r>
+      <w:r>
+        <w:t xml:space="preserve">(specific conductivity,</w:t>
+      </w:r>
+      <w:r>
+        <w:t xml:space="preserve"> </w:t>
+      </w:r>
+      <w:r>
+        <w:t xml:space="preserve">mS/cm) per point via a root-find (</w:t>
+      </w:r>
+      <w:r>
+        <w:rPr>
+          <w:rStyle w:val="VerbatimChar"/>
+        </w:rPr>
+        <w:t xml:space="preserve">scipy.optimize.bisect</w:t>
+      </w:r>
+      <w:r>
+        <w:t xml:space="preserve">), salt-specific parameters.</w:t>
+      </w:r>
+    </w:p>
+    <w:p>
+      <w:pPr>
+        <w:pStyle w:val="Compact"/>
+        <w:numPr>
+          <w:ilvl w:val="0"/>
+          <w:numId w:val="1021"/>
+        </w:numPr>
+      </w:pPr>
+      <w:r>
+        <w:rPr>
+          <w:rStyle w:val="VerbatimChar"/>
+          <w:b/>
+          <w:bCs/>
+        </w:rPr>
+        <w:t xml:space="preserve">"msa"</w:t>
+      </w:r>
+      <w:r>
+        <w:t xml:space="preserve"> </w:t>
+      </w:r>
+      <w:r>
+        <w:t xml:space="preserve">— invert</w:t>
+      </w:r>
+      <w:r>
+        <w:t xml:space="preserve"> </w:t>
+      </w:r>
+      <w:r>
+        <w:rPr>
+          <w:rStyle w:val="VerbatimChar"/>
+        </w:rPr>
+        <w:t xml:space="preserve">conductivity_paper.msa_transport(...)</w:t>
+      </w:r>
+      <w:r>
+        <w:t xml:space="preserve"> </w:t>
+      </w:r>
+      <w:r>
+        <w:t xml:space="preserve">(mean spherical approximation;</w:t>
+      </w:r>
+      <w:r>
+        <w:t xml:space="preserve"> </w:t>
+      </w:r>
+      <w:r>
+        <w:t xml:space="preserve">multi-salt capable) per point.</w:t>
+      </w:r>
+    </w:p>
+    <w:p>
+      <w:pPr>
+        <w:pStyle w:val="Compact"/>
+        <w:numPr>
+          <w:ilvl w:val="0"/>
+          <w:numId w:val="1021"/>
+        </w:numPr>
+      </w:pPr>
+      <w:r>
+        <w:rPr>
+          <w:rStyle w:val="VerbatimChar"/>
+          <w:b/>
+          <w:bCs/>
+        </w:rPr>
+        <w:t xml:space="preserve">"data2"</w:t>
+      </w:r>
+      <w:r>
+        <w:t xml:space="preserve"> </w:t>
+      </w:r>
+      <w:r>
+        <w:t xml:space="preserve">— the conductivity↔concentration model used in the</w:t>
+      </w:r>
+      <w:r>
+        <w:t xml:space="preserve"> </w:t>
+      </w:r>
+      <w:r>
+        <w:rPr>
+          <w:b/>
+          <w:bCs/>
+        </w:rPr>
+        <w:t xml:space="preserve">DATA2 workflow</w:t>
+      </w:r>
+      <w:r>
+        <w:t xml:space="preserve">. Locate it in</w:t>
+      </w:r>
+      <w:r>
+        <w:t xml:space="preserve"> </w:t>
+      </w:r>
+      <w:r>
+        <w:t xml:space="preserve">the DATA2</w:t>
+      </w:r>
+      <w:r>
+        <w:t xml:space="preserve"> </w:t>
+      </w:r>
+      <w:r>
+        <w:rPr>
+          <w:rStyle w:val="VerbatimChar"/>
+        </w:rPr>
+        <w:t xml:space="preserve">.mat</w:t>
+      </w:r>
+      <w:r>
+        <w:t xml:space="preserve"> </w:t>
+      </w:r>
+      <w:r>
+        <w:t xml:space="preserve">loader / DATA2 reproduction code (and the DATA2 paper) and port/wrap it here;</w:t>
+      </w:r>
+      <w:r>
+        <w:t xml:space="preserve"> </w:t>
+      </w:r>
+      <w:r>
+        <w:t xml:space="preserve">do</w:t>
+      </w:r>
+      <w:r>
+        <w:t xml:space="preserve"> </w:t>
+      </w:r>
+      <w:r>
+        <w:rPr>
+          <w:b/>
+          <w:bCs/>
+        </w:rPr>
+        <w:t xml:space="preserve">not</w:t>
+      </w:r>
+      <w:r>
+        <w:t xml:space="preserve"> </w:t>
+      </w:r>
+      <w:r>
+        <w:t xml:space="preserve">modify the DATA2 workflow itself.</w:t>
+      </w:r>
+    </w:p>
+    <w:p>
+      <w:pPr>
+        <w:pStyle w:val="FirstParagraph"/>
+      </w:pPr>
+      <w:r>
+        <w:rPr>
+          <w:b/>
+          <w:bCs/>
+        </w:rPr>
+        <w:t xml:space="preserve">API.</w:t>
+      </w:r>
+      <w:r>
+        <w:t xml:space="preserve"> </w:t>
+      </w:r>
+      <w:r>
+        <w:t xml:space="preserve">e.g.</w:t>
+      </w:r>
+      <w:r>
+        <w:t xml:space="preserve"> </w:t>
+      </w:r>
+      <w:r>
+        <w:rPr>
+          <w:rStyle w:val="VerbatimChar"/>
+        </w:rPr>
+        <w:t xml:space="preserve">concentration_to_conductivity(c, salt, T, *, method=...)</w:t>
+      </w:r>
+      <w:r>
+        <w:t xml:space="preserve"> </w:t>
+      </w:r>
+      <w:r>
+        <w:t xml:space="preserve">and the inverse</w:t>
+      </w:r>
+      <w:r>
+        <w:t xml:space="preserve"> </w:t>
+      </w:r>
+      <w:r>
+        <w:rPr>
+          <w:rStyle w:val="VerbatimChar"/>
+        </w:rPr>
+        <w:t xml:space="preserve">conductivity_to_concentration(cond, salt, T, *, method=...)</w:t>
+      </w:r>
+      <w:r>
+        <w:t xml:space="preserve">, with</w:t>
+      </w:r>
+      <w:r>
+        <w:t xml:space="preserve"> </w:t>
+      </w:r>
+      <w:r>
+        <w:rPr>
+          <w:rStyle w:val="VerbatimChar"/>
+        </w:rPr>
+        <w:t xml:space="preserve">method ∈ {"shedlovsky","msa","data2"}</w:t>
+      </w:r>
+      <w:r>
+        <w:t xml:space="preserve">; forward and inverse must round-trip within tolerance.</w:t>
+      </w:r>
+    </w:p>
+    <w:p>
+      <w:pPr>
+        <w:pStyle w:val="BodyText"/>
+      </w:pPr>
+      <w:r>
+        <w:rPr>
+          <w:b/>
+          <w:bCs/>
+        </w:rPr>
+        <w:t xml:space="preserve">Where used.</w:t>
+      </w:r>
+      <w:r>
+        <w:t xml:space="preserve"> </w:t>
+      </w:r>
+      <w:r>
+        <w:t xml:space="preserve">Route</w:t>
+      </w:r>
+      <w:r>
+        <w:t xml:space="preserve"> </w:t>
+      </w:r>
+      <w:r>
+        <w:rPr>
+          <w:b/>
+          <w:bCs/>
+        </w:rPr>
+        <w:t xml:space="preserve">every</w:t>
+      </w:r>
+      <w:r>
+        <w:t xml:space="preserve"> </w:t>
+      </w:r>
+      <w:r>
+        <w:t xml:space="preserve">conductivity↔concentration mapping through this function — the</w:t>
+      </w:r>
+      <w:r>
+        <w:t xml:space="preserve"> </w:t>
+      </w:r>
+      <w:r>
+        <w:t xml:space="preserve">conductivity-derived plots (Task 3, plots 6–7), the conductivity-space and concentration-space</w:t>
+      </w:r>
+      <w:r>
+        <w:t xml:space="preserve"> </w:t>
+      </w:r>
+      <w:r>
+        <w:t xml:space="preserve">WSSE channels (Tasks 5 / 8 / 9), and any loader conversion that should be model-agnostic. Make the</w:t>
+      </w:r>
+      <w:r>
+        <w:t xml:space="preserve"> </w:t>
+      </w:r>
+      <w:r>
+        <w:t xml:space="preserve">default method configurable per run (e.g.</w:t>
+      </w:r>
+      <w:r>
+        <w:t xml:space="preserve"> </w:t>
+      </w:r>
+      <w:r>
+        <w:rPr>
+          <w:rStyle w:val="VerbatimChar"/>
+        </w:rPr>
+        <w:t xml:space="preserve">data_config['cond_model']</w:t>
+      </w:r>
+      <w:r>
+        <w:t xml:space="preserve">); guard so DATA1/DATA2</w:t>
+      </w:r>
+      <w:r>
+        <w:t xml:space="preserve"> </w:t>
+      </w:r>
+      <w:r>
+        <w:t xml:space="preserve">behavior is unchanged unless a method is explicitly selected.</w:t>
+      </w:r>
+    </w:p>
+    <w:p>
+      <w:pPr>
+        <w:pStyle w:val="BodyText"/>
+      </w:pPr>
+      <w:r>
+        <w:rPr>
+          <w:b/>
+          <w:bCs/>
+        </w:rPr>
+        <w:t xml:space="preserve">Acceptance.</w:t>
+      </w:r>
+      <w:r>
+        <w:t xml:space="preserve"> </w:t>
+      </w:r>
+      <w:r>
+        <w:t xml:space="preserve">For one DATA3 sheet, the three backends each produce a conductivity→concentration</w:t>
+      </w:r>
+      <w:r>
+        <w:t xml:space="preserve"> </w:t>
+      </w:r>
+      <w:r>
+        <w:t xml:space="preserve">curve; overlay them (plus the loader's existing conversion) to show agreement/disagreement;</w:t>
+      </w:r>
+      <w:r>
+        <w:t xml:space="preserve"> </w:t>
+      </w:r>
+      <w:r>
+        <w:t xml:space="preserve">round-trip (</w:t>
+      </w:r>
+      <w:r>
+        <w:rPr>
+          <w:rStyle w:val="VerbatimChar"/>
+        </w:rPr>
+        <w:t xml:space="preserve">c → cond → c</w:t>
+      </w:r>
+      <w:r>
+        <w:t xml:space="preserve">) is consistent for each method; the conductivity-derived figures and</w:t>
+      </w:r>
+      <w:r>
+        <w:t xml:space="preserve"> </w:t>
+      </w:r>
+      <w:r>
+        <w:t xml:space="preserve">contours regenerate under any chosen method via a single switch.</w:t>
+      </w:r>
+    </w:p>
+    <w:p>
+      <w:r>
+        <w:pict>
+          <v:rect style="width:0;height:1.5pt" o:hralign="center" o:hrstd="t" o:hr="t"/>
+        </w:pict>
+      </w:r>
+    </w:p>
+    <w:bookmarkEnd w:id="21"/>
+    <w:bookmarkStart w:id="22" w:name="verification-checklist-run-at-the-end"/>
+    <w:p>
+      <w:pPr>
+        <w:pStyle w:val="Heading2"/>
+      </w:pPr>
+      <w:r>
         <w:t xml:space="preserve">Verification checklist (run at the end)</w:t>
       </w:r>
     </w:p>
@@ -5882,7 +6368,7 @@
         <w:pStyle w:val="Compact"/>
         <w:numPr>
           <w:ilvl w:val="0"/>
-          <w:numId w:val="1021"/>
+          <w:numId w:val="1022"/>
         </w:numPr>
       </w:pPr>
       <w:r>
@@ -5903,7 +6389,7 @@
         <w:pStyle w:val="Compact"/>
         <w:numPr>
           <w:ilvl w:val="0"/>
-          <w:numId w:val="1021"/>
+          <w:numId w:val="1022"/>
         </w:numPr>
       </w:pPr>
       <w:r>
@@ -5915,7 +6401,7 @@
         <w:pStyle w:val="Compact"/>
         <w:numPr>
           <w:ilvl w:val="0"/>
-          <w:numId w:val="1021"/>
+          <w:numId w:val="1022"/>
         </w:numPr>
       </w:pPr>
       <w:r>
@@ -5933,7 +6419,7 @@
         <w:pStyle w:val="Compact"/>
         <w:numPr>
           <w:ilvl w:val="0"/>
-          <w:numId w:val="1021"/>
+          <w:numId w:val="1022"/>
         </w:numPr>
       </w:pPr>
       <w:r>
@@ -5951,7 +6437,7 @@
         <w:pStyle w:val="Compact"/>
         <w:numPr>
           <w:ilvl w:val="0"/>
-          <w:numId w:val="1021"/>
+          <w:numId w:val="1022"/>
         </w:numPr>
       </w:pPr>
       <w:r>
@@ -5969,7 +6455,7 @@
         <w:pStyle w:val="Compact"/>
         <w:numPr>
           <w:ilvl w:val="0"/>
-          <w:numId w:val="1021"/>
+          <w:numId w:val="1022"/>
         </w:numPr>
       </w:pPr>
       <w:r>
@@ -5993,7 +6479,7 @@
         <w:pStyle w:val="Compact"/>
         <w:numPr>
           <w:ilvl w:val="0"/>
-          <w:numId w:val="1021"/>
+          <w:numId w:val="1022"/>
         </w:numPr>
       </w:pPr>
       <w:r>
@@ -6017,7 +6503,7 @@
         <w:pStyle w:val="Compact"/>
         <w:numPr>
           <w:ilvl w:val="0"/>
-          <w:numId w:val="1021"/>
+          <w:numId w:val="1022"/>
         </w:numPr>
       </w:pPr>
       <w:r>
@@ -6035,7 +6521,25 @@
         <w:pStyle w:val="Compact"/>
         <w:numPr>
           <w:ilvl w:val="0"/>
-          <w:numId w:val="1021"/>
+          <w:numId w:val="1022"/>
+        </w:numPr>
+      </w:pPr>
+      <w:r>
+        <w:t xml:space="preserve">Selectable conductivity↔concentration converter (Task 11) with Shedlovsky / MSA / DATA2 backends;</w:t>
+      </w:r>
+      <w:r>
+        <w:t xml:space="preserve"> </w:t>
+      </w:r>
+      <w:r>
+        <w:t xml:space="preserve">round-trip consistent; conductivity-derived plots &amp; contours regenerable under any method.</w:t>
+      </w:r>
+    </w:p>
+    <w:p>
+      <w:pPr>
+        <w:pStyle w:val="Compact"/>
+        <w:numPr>
+          <w:ilvl w:val="0"/>
+          <w:numId w:val="1022"/>
         </w:numPr>
       </w:pPr>
       <w:r>
@@ -6047,7 +6551,7 @@
         <w:pStyle w:val="Compact"/>
         <w:numPr>
           <w:ilvl w:val="0"/>
-          <w:numId w:val="1021"/>
+          <w:numId w:val="1022"/>
         </w:numPr>
       </w:pPr>
       <w:r>
@@ -6065,7 +6569,7 @@
         <w:pStyle w:val="Compact"/>
         <w:numPr>
           <w:ilvl w:val="0"/>
-          <w:numId w:val="1021"/>
+          <w:numId w:val="1022"/>
         </w:numPr>
       </w:pPr>
       <w:r>
@@ -6081,8 +6585,8 @@
         <w:t xml:space="preserve">updated with the new time-correction config + plotting helpers.</w:t>
       </w:r>
     </w:p>
-    <w:bookmarkEnd w:id="21"/>
-    <w:bookmarkStart w:id="22" w:name="assumptions-baked-in-change-if-wrong"/>
+    <w:bookmarkEnd w:id="22"/>
+    <w:bookmarkStart w:id="23" w:name="assumptions-baked-in-change-if-wrong"/>
     <w:p>
       <w:pPr>
         <w:pStyle w:val="Heading2"/>
@@ -6096,7 +6600,7 @@
         <w:pStyle w:val="Compact"/>
         <w:numPr>
           <w:ilvl w:val="0"/>
-          <w:numId w:val="1022"/>
+          <w:numId w:val="1023"/>
         </w:numPr>
       </w:pPr>
       <w:r>
@@ -6130,7 +6634,7 @@
         <w:pStyle w:val="Compact"/>
         <w:numPr>
           <w:ilvl w:val="0"/>
-          <w:numId w:val="1022"/>
+          <w:numId w:val="1023"/>
         </w:numPr>
       </w:pPr>
       <w:r>
@@ -6162,8 +6666,8 @@
         <w:t xml:space="preserve">inversion for now.</w:t>
       </w:r>
     </w:p>
-    <w:bookmarkEnd w:id="22"/>
     <w:bookmarkEnd w:id="23"/>
+    <w:bookmarkEnd w:id="24"/>
     <w:sectPr>
       <w:footnotePr>
         <w:numRestart w:val="eachSect"/>
@@ -6664,6 +7168,9 @@
     <w:abstractNumId w:val="991"/>
   </w:num>
   <w:num w:numId="1022">
+    <w:abstractNumId w:val="991"/>
+  </w:num>
+  <w:num w:numId="1023">
     <w:abstractNumId w:val="991"/>
   </w:num>
 </w:numbering>

</xml_diff>